<commit_message>
Further Corrections & Updates
</commit_message>
<xml_diff>
--- a/EconAutomation/src/supporting_docs/econ_report_templates/PVLCP_report_template.docx
+++ b/EconAutomation/src/supporting_docs/econ_report_templates/PVLCP_report_template.docx
@@ -51,7 +51,7 @@
           <w:sz w:val="24"/>
           <w:szCs w:val="24"/>
         </w:rPr>
-        <w:t>April 30, 2026</w:t>
+        <w:t>May 1, 2026</w:t>
       </w:r>
       <w:r>
         <w:rPr>
@@ -89,7 +89,6 @@
           <w:color w:val="000000"/>
           <w:sz w:val="23"/>
           <w:szCs w:val="23"/>
-          <w:highlight w:val="yellow"/>
         </w:rPr>
       </w:pPr>
       <w:r>
@@ -98,7 +97,6 @@
           <w:color w:val="000000"/>
           <w:sz w:val="23"/>
           <w:szCs w:val="23"/>
-          <w:highlight w:val="yellow"/>
         </w:rPr>
         <w:t xml:space="preserve">{{ </w:t>
       </w:r>
@@ -108,7 +106,6 @@
           <w:color w:val="000000"/>
           <w:sz w:val="23"/>
           <w:szCs w:val="23"/>
-          <w:highlight w:val="yellow"/>
         </w:rPr>
         <w:t>attorney_salutation_with_name_full</w:t>
       </w:r>
@@ -118,7 +115,6 @@
           <w:color w:val="000000"/>
           <w:sz w:val="23"/>
           <w:szCs w:val="23"/>
-          <w:highlight w:val="yellow"/>
         </w:rPr>
         <w:t xml:space="preserve"> }}</w:t>
       </w:r>
@@ -132,30 +128,19 @@
         <w:spacing w:after="0" w:line="240" w:lineRule="auto"/>
         <w:rPr>
           <w:rFonts w:ascii="Times New Roman" w:hAnsi="Times New Roman" w:cs="Times New Roman"/>
-          <w:iCs/>
-          <w:sz w:val="24"/>
-          <w:szCs w:val="24"/>
-        </w:rPr>
-      </w:pPr>
-      <w:r>
-        <w:rPr>
-          <w:rFonts w:ascii="Times New Roman" w:hAnsi="Times New Roman" w:cs="Times New Roman"/>
           <w:color w:val="000000"/>
           <w:sz w:val="23"/>
           <w:szCs w:val="23"/>
-          <w:highlight w:val="yellow"/>
-        </w:rPr>
-        <w:t xml:space="preserve">{{ </w:t>
-      </w:r>
+        </w:rPr>
+      </w:pPr>
       <w:r>
         <w:rPr>
           <w:rFonts w:ascii="Times New Roman" w:hAnsi="Times New Roman" w:cs="Times New Roman"/>
           <w:color w:val="000000"/>
           <w:sz w:val="23"/>
           <w:szCs w:val="23"/>
-          <w:highlight w:val="yellow"/>
-        </w:rPr>
-        <w:t>firm_address_full</w:t>
+        </w:rPr>
+        <w:t xml:space="preserve">{{ </w:t>
       </w:r>
       <w:r>
         <w:rPr>
@@ -163,7 +148,24 @@
           <w:color w:val="000000"/>
           <w:sz w:val="23"/>
           <w:szCs w:val="23"/>
-          <w:highlight w:val="yellow"/>
+        </w:rPr>
+        <w:t>firm_address_</w:t>
+      </w:r>
+      <w:r>
+        <w:rPr>
+          <w:rFonts w:ascii="Times New Roman" w:hAnsi="Times New Roman" w:cs="Times New Roman"/>
+          <w:color w:val="000000"/>
+          <w:sz w:val="23"/>
+          <w:szCs w:val="23"/>
+        </w:rPr>
+        <w:t>1</w:t>
+      </w:r>
+      <w:r>
+        <w:rPr>
+          <w:rFonts w:ascii="Times New Roman" w:hAnsi="Times New Roman" w:cs="Times New Roman"/>
+          <w:color w:val="000000"/>
+          <w:sz w:val="23"/>
+          <w:szCs w:val="23"/>
         </w:rPr>
         <w:t xml:space="preserve"> }}</w:t>
       </w:r>
@@ -182,6 +184,15 @@
           <w:szCs w:val="24"/>
         </w:rPr>
       </w:pPr>
+      <w:r>
+        <w:rPr>
+          <w:rFonts w:ascii="Times New Roman" w:hAnsi="Times New Roman" w:cs="Times New Roman"/>
+          <w:color w:val="000000"/>
+          <w:sz w:val="23"/>
+          <w:szCs w:val="23"/>
+        </w:rPr>
+        <w:t>{{ firm_address_2 }}</w:t>
+      </w:r>
     </w:p>
     <w:p>
       <w:pPr>
@@ -200,6 +211,21 @@
     </w:p>
     <w:p>
       <w:pPr>
+        <w:widowControl w:val="0"/>
+        <w:autoSpaceDE w:val="0"/>
+        <w:autoSpaceDN w:val="0"/>
+        <w:adjustRightInd w:val="0"/>
+        <w:spacing w:after="0" w:line="240" w:lineRule="auto"/>
+        <w:rPr>
+          <w:rFonts w:ascii="Times New Roman" w:hAnsi="Times New Roman" w:cs="Times New Roman"/>
+          <w:iCs/>
+          <w:sz w:val="24"/>
+          <w:szCs w:val="24"/>
+        </w:rPr>
+      </w:pPr>
+    </w:p>
+    <w:p>
+      <w:pPr>
         <w:pStyle w:val="Default"/>
         <w:rPr>
           <w:b/>
@@ -232,7 +258,6 @@
           <w:bCs/>
           <w:i/>
           <w:iCs/>
-          <w:highlight w:val="yellow"/>
         </w:rPr>
         <w:t>{{</w:t>
       </w:r>
@@ -242,7 +267,6 @@
           <w:bCs/>
           <w:i/>
           <w:iCs/>
-          <w:highlight w:val="yellow"/>
         </w:rPr>
         <w:t>r</w:t>
       </w:r>
@@ -252,7 +276,6 @@
           <w:bCs/>
           <w:i/>
           <w:iCs/>
-          <w:highlight w:val="yellow"/>
         </w:rPr>
         <w:t xml:space="preserve"> </w:t>
       </w:r>
@@ -262,9 +285,8 @@
           <w:bCs/>
           <w:i/>
           <w:iCs/>
-          <w:highlight w:val="yellow"/>
-        </w:rPr>
-        <w:t>firm_email</w:t>
+        </w:rPr>
+        <w:t>attorney</w:t>
       </w:r>
       <w:r>
         <w:rPr>
@@ -272,7 +294,15 @@
           <w:bCs/>
           <w:i/>
           <w:iCs/>
-          <w:highlight w:val="yellow"/>
+        </w:rPr>
+        <w:t>_email</w:t>
+      </w:r>
+      <w:r>
+        <w:rPr>
+          <w:b/>
+          <w:bCs/>
+          <w:i/>
+          <w:iCs/>
         </w:rPr>
         <w:t xml:space="preserve"> }}</w:t>
       </w:r>
@@ -369,7 +399,6 @@
           <w:color w:val="000000"/>
           <w:sz w:val="23"/>
           <w:szCs w:val="23"/>
-          <w:highlight w:val="yellow"/>
         </w:rPr>
         <w:t xml:space="preserve">{{ </w:t>
       </w:r>
@@ -379,7 +408,6 @@
           <w:color w:val="000000"/>
           <w:sz w:val="23"/>
           <w:szCs w:val="23"/>
-          <w:highlight w:val="yellow"/>
         </w:rPr>
         <w:t>claimant_name_f</w:t>
       </w:r>
@@ -389,7 +417,6 @@
           <w:color w:val="000000"/>
           <w:sz w:val="23"/>
           <w:szCs w:val="23"/>
-          <w:highlight w:val="yellow"/>
         </w:rPr>
         <w:t>ull</w:t>
       </w:r>
@@ -399,20 +426,89 @@
           <w:color w:val="000000"/>
           <w:sz w:val="23"/>
           <w:szCs w:val="23"/>
+        </w:rPr>
+        <w:t xml:space="preserve"> }}</w:t>
+      </w:r>
+    </w:p>
+    <w:p>
+      <w:pPr>
+        <w:spacing w:line="240" w:lineRule="auto"/>
+        <w:rPr>
+          <w:rFonts w:ascii="Times New Roman" w:hAnsi="Times New Roman" w:cs="Times New Roman"/>
+          <w:sz w:val="24"/>
+          <w:szCs w:val="24"/>
+        </w:rPr>
+      </w:pPr>
+    </w:p>
+    <w:p>
+      <w:pPr>
+        <w:jc w:val="both"/>
+        <w:rPr>
+          <w:rFonts w:ascii="Times New Roman" w:hAnsi="Times New Roman" w:cs="Times New Roman"/>
+          <w:sz w:val="24"/>
+          <w:szCs w:val="24"/>
+        </w:rPr>
+      </w:pPr>
+      <w:r>
+        <w:rPr>
+          <w:rFonts w:ascii="Times New Roman" w:hAnsi="Times New Roman" w:cs="Times New Roman"/>
+          <w:sz w:val="24"/>
+          <w:szCs w:val="24"/>
+        </w:rPr>
+        <w:t>Dear</w:t>
+      </w:r>
+      <w:r>
+        <w:rPr>
+          <w:rFonts w:ascii="Times New Roman" w:hAnsi="Times New Roman" w:cs="Times New Roman"/>
+          <w:sz w:val="24"/>
+          <w:szCs w:val="24"/>
+        </w:rPr>
+        <w:t xml:space="preserve"> </w:t>
+      </w:r>
+      <w:r>
+        <w:rPr>
+          <w:rFonts w:ascii="Times New Roman" w:hAnsi="Times New Roman" w:cs="Times New Roman"/>
+          <w:sz w:val="24"/>
+          <w:szCs w:val="24"/>
           <w:highlight w:val="yellow"/>
         </w:rPr>
+        <w:t xml:space="preserve">{{ </w:t>
+      </w:r>
+      <w:r>
+        <w:rPr>
+          <w:rFonts w:ascii="Times New Roman" w:hAnsi="Times New Roman" w:cs="Times New Roman"/>
+          <w:sz w:val="24"/>
+          <w:szCs w:val="24"/>
+          <w:highlight w:val="yellow"/>
+        </w:rPr>
+        <w:t>attorney_salutation</w:t>
+      </w:r>
+      <w:r>
+        <w:rPr>
+          <w:rFonts w:ascii="Times New Roman" w:hAnsi="Times New Roman" w:cs="Times New Roman"/>
+          <w:sz w:val="24"/>
+          <w:szCs w:val="24"/>
+          <w:highlight w:val="yellow"/>
+        </w:rPr>
+        <w:t>_with_name_last</w:t>
+      </w:r>
+      <w:r>
+        <w:rPr>
+          <w:rFonts w:ascii="Times New Roman" w:hAnsi="Times New Roman" w:cs="Times New Roman"/>
+          <w:sz w:val="24"/>
+          <w:szCs w:val="24"/>
+          <w:highlight w:val="yellow"/>
+        </w:rPr>
         <w:t xml:space="preserve"> }}</w:t>
       </w:r>
-    </w:p>
-    <w:p>
-      <w:pPr>
-        <w:spacing w:line="240" w:lineRule="auto"/>
-        <w:rPr>
-          <w:rFonts w:ascii="Times New Roman" w:hAnsi="Times New Roman" w:cs="Times New Roman"/>
-          <w:sz w:val="24"/>
-          <w:szCs w:val="24"/>
-        </w:rPr>
-      </w:pPr>
+      <w:r>
+        <w:rPr>
+          <w:rFonts w:ascii="Times New Roman" w:hAnsi="Times New Roman" w:cs="Times New Roman"/>
+          <w:sz w:val="24"/>
+          <w:szCs w:val="24"/>
+        </w:rPr>
+        <w:t>:</w:t>
+      </w:r>
     </w:p>
     <w:p>
       <w:pPr>
@@ -429,7 +525,67 @@
           <w:sz w:val="24"/>
           <w:szCs w:val="24"/>
         </w:rPr>
-        <w:t>Dear</w:t>
+        <w:t>I</w:t>
+      </w:r>
+      <w:r>
+        <w:rPr>
+          <w:rFonts w:ascii="Times New Roman" w:hAnsi="Times New Roman" w:cs="Times New Roman"/>
+          <w:sz w:val="24"/>
+          <w:szCs w:val="24"/>
+        </w:rPr>
+        <w:t xml:space="preserve"> have reviewed the </w:t>
+      </w:r>
+      <w:r>
+        <w:rPr>
+          <w:rFonts w:ascii="Times New Roman" w:hAnsi="Times New Roman" w:cs="Times New Roman"/>
+          <w:sz w:val="24"/>
+          <w:szCs w:val="24"/>
+          <w:highlight w:val="green"/>
+        </w:rPr>
+        <w:t>Life Care Plan</w:t>
+      </w:r>
+      <w:r>
+        <w:rPr>
+          <w:rFonts w:ascii="Times New Roman" w:hAnsi="Times New Roman" w:cs="Times New Roman"/>
+          <w:sz w:val="24"/>
+          <w:szCs w:val="24"/>
+        </w:rPr>
+        <w:t xml:space="preserve"> from </w:t>
+      </w:r>
+      <w:r>
+        <w:rPr>
+          <w:rFonts w:ascii="Times New Roman" w:hAnsi="Times New Roman" w:cs="Times New Roman"/>
+          <w:sz w:val="24"/>
+          <w:szCs w:val="24"/>
+          <w:highlight w:val="yellow"/>
+        </w:rPr>
+        <w:t xml:space="preserve">{{ </w:t>
+      </w:r>
+      <w:r>
+        <w:rPr>
+          <w:rFonts w:ascii="Times New Roman" w:hAnsi="Times New Roman" w:cs="Times New Roman"/>
+          <w:sz w:val="24"/>
+          <w:szCs w:val="24"/>
+          <w:highlight w:val="yellow"/>
+        </w:rPr>
+        <w:t>LCP_</w:t>
+      </w:r>
+      <w:r>
+        <w:rPr>
+          <w:rFonts w:ascii="Times New Roman" w:hAnsi="Times New Roman" w:cs="Times New Roman"/>
+          <w:sz w:val="24"/>
+          <w:szCs w:val="24"/>
+          <w:highlight w:val="yellow"/>
+        </w:rPr>
+        <w:t>expert }}</w:t>
+      </w:r>
+      <w:r>
+        <w:rPr>
+          <w:rFonts w:ascii="Times New Roman" w:hAnsi="Times New Roman" w:cs="Times New Roman"/>
+          <w:sz w:val="24"/>
+          <w:szCs w:val="24"/>
+        </w:rPr>
+        <w:t>,</w:t>
       </w:r>
       <w:r>
         <w:rPr>
@@ -444,6 +600,14 @@
           <w:rFonts w:ascii="Times New Roman" w:hAnsi="Times New Roman" w:cs="Times New Roman"/>
           <w:sz w:val="24"/>
           <w:szCs w:val="24"/>
+        </w:rPr>
+        <w:t xml:space="preserve">dated </w:t>
+      </w:r>
+      <w:r>
+        <w:rPr>
+          <w:rFonts w:ascii="Times New Roman" w:hAnsi="Times New Roman" w:cs="Times New Roman"/>
+          <w:sz w:val="24"/>
+          <w:szCs w:val="24"/>
           <w:highlight w:val="yellow"/>
         </w:rPr>
         <w:t xml:space="preserve">{{ </w:t>
@@ -455,7 +619,7 @@
           <w:szCs w:val="24"/>
           <w:highlight w:val="yellow"/>
         </w:rPr>
-        <w:t>attorney_salutation</w:t>
+        <w:t>report_deadline_long</w:t>
       </w:r>
       <w:r>
         <w:rPr>
@@ -464,7 +628,7 @@
           <w:szCs w:val="24"/>
           <w:highlight w:val="yellow"/>
         </w:rPr>
-        <w:t>_with_name_last</w:t>
+        <w:t xml:space="preserve"> }}</w:t>
       </w:r>
       <w:r>
         <w:rPr>
@@ -473,6 +637,64 @@
           <w:szCs w:val="24"/>
           <w:highlight w:val="yellow"/>
         </w:rPr>
+        <w:t>.</w:t>
+      </w:r>
+      <w:r>
+        <w:rPr>
+          <w:rFonts w:ascii="Times New Roman" w:hAnsi="Times New Roman" w:cs="Times New Roman"/>
+          <w:sz w:val="24"/>
+          <w:szCs w:val="24"/>
+        </w:rPr>
+        <w:t xml:space="preserve"> </w:t>
+      </w:r>
+      <w:r>
+        <w:rPr>
+          <w:rFonts w:ascii="Times New Roman" w:hAnsi="Times New Roman" w:cs="Times New Roman"/>
+          <w:sz w:val="24"/>
+          <w:szCs w:val="24"/>
+        </w:rPr>
+        <w:t>The plaintiff</w:t>
+      </w:r>
+      <w:r>
+        <w:rPr>
+          <w:rFonts w:ascii="Times New Roman" w:hAnsi="Times New Roman" w:cs="Times New Roman"/>
+          <w:sz w:val="24"/>
+          <w:szCs w:val="24"/>
+        </w:rPr>
+        <w:t xml:space="preserve"> will require a present value ranging from</w:t>
+      </w:r>
+      <w:r>
+        <w:rPr>
+          <w:rFonts w:ascii="Times New Roman" w:hAnsi="Times New Roman" w:cs="Times New Roman"/>
+          <w:sz w:val="24"/>
+          <w:szCs w:val="24"/>
+        </w:rPr>
+        <w:t xml:space="preserve"> </w:t>
+      </w:r>
+      <w:r>
+        <w:rPr>
+          <w:rFonts w:ascii="Times New Roman" w:hAnsi="Times New Roman" w:cs="Times New Roman"/>
+          <w:sz w:val="24"/>
+          <w:szCs w:val="24"/>
+          <w:highlight w:val="yellow"/>
+        </w:rPr>
+        <w:t xml:space="preserve">{{ </w:t>
+      </w:r>
+      <w:r>
+        <w:rPr>
+          <w:rFonts w:ascii="Times New Roman" w:hAnsi="Times New Roman" w:cs="Times New Roman"/>
+          <w:sz w:val="24"/>
+          <w:szCs w:val="24"/>
+        </w:rPr>
+        <w:t>WC_CPI_onetime_cost_low</w:t>
+      </w:r>
+      <w:r>
+        <w:rPr>
+          <w:rFonts w:ascii="Times New Roman" w:hAnsi="Times New Roman" w:cs="Times New Roman"/>
+          <w:sz w:val="24"/>
+          <w:szCs w:val="24"/>
+          <w:highlight w:val="yellow"/>
+        </w:rPr>
         <w:t xml:space="preserve"> }}</w:t>
       </w:r>
       <w:r>
@@ -481,50 +703,15 @@
           <w:sz w:val="24"/>
           <w:szCs w:val="24"/>
         </w:rPr>
-        <w:t>:</w:t>
-      </w:r>
-    </w:p>
-    <w:p>
-      <w:pPr>
-        <w:jc w:val="both"/>
-        <w:rPr>
-          <w:rFonts w:ascii="Times New Roman" w:hAnsi="Times New Roman" w:cs="Times New Roman"/>
-          <w:sz w:val="24"/>
-          <w:szCs w:val="24"/>
-        </w:rPr>
-      </w:pPr>
-      <w:r>
-        <w:rPr>
-          <w:rFonts w:ascii="Times New Roman" w:hAnsi="Times New Roman" w:cs="Times New Roman"/>
-          <w:sz w:val="24"/>
-          <w:szCs w:val="24"/>
-        </w:rPr>
-        <w:t>I</w:t>
-      </w:r>
-      <w:r>
-        <w:rPr>
-          <w:rFonts w:ascii="Times New Roman" w:hAnsi="Times New Roman" w:cs="Times New Roman"/>
-          <w:sz w:val="24"/>
-          <w:szCs w:val="24"/>
-        </w:rPr>
-        <w:t xml:space="preserve"> have reviewed the </w:t>
-      </w:r>
-      <w:r>
-        <w:rPr>
-          <w:rFonts w:ascii="Times New Roman" w:hAnsi="Times New Roman" w:cs="Times New Roman"/>
-          <w:sz w:val="24"/>
-          <w:szCs w:val="24"/>
-          <w:highlight w:val="green"/>
-        </w:rPr>
-        <w:t>Life Care Plan</w:t>
-      </w:r>
-      <w:r>
-        <w:rPr>
-          <w:rFonts w:ascii="Times New Roman" w:hAnsi="Times New Roman" w:cs="Times New Roman"/>
-          <w:sz w:val="24"/>
-          <w:szCs w:val="24"/>
-        </w:rPr>
-        <w:t xml:space="preserve"> from </w:t>
+        <w:t xml:space="preserve"> </w:t>
+      </w:r>
+      <w:r>
+        <w:rPr>
+          <w:rFonts w:ascii="Times New Roman" w:hAnsi="Times New Roman" w:cs="Times New Roman"/>
+          <w:sz w:val="24"/>
+          <w:szCs w:val="24"/>
+        </w:rPr>
+        <w:t xml:space="preserve">to </w:t>
       </w:r>
       <w:r>
         <w:rPr>
@@ -540,171 +727,8 @@
           <w:rFonts w:ascii="Times New Roman" w:hAnsi="Times New Roman" w:cs="Times New Roman"/>
           <w:sz w:val="24"/>
           <w:szCs w:val="24"/>
-          <w:highlight w:val="yellow"/>
-        </w:rPr>
-        <w:t>LCP_</w:t>
-      </w:r>
-      <w:r>
-        <w:rPr>
-          <w:rFonts w:ascii="Times New Roman" w:hAnsi="Times New Roman" w:cs="Times New Roman"/>
-          <w:sz w:val="24"/>
-          <w:szCs w:val="24"/>
-          <w:highlight w:val="yellow"/>
-        </w:rPr>
-        <w:t>expert }}</w:t>
-      </w:r>
-      <w:r>
-        <w:rPr>
-          <w:rFonts w:ascii="Times New Roman" w:hAnsi="Times New Roman" w:cs="Times New Roman"/>
-          <w:sz w:val="24"/>
-          <w:szCs w:val="24"/>
-        </w:rPr>
-        <w:t>,</w:t>
-      </w:r>
-      <w:r>
-        <w:rPr>
-          <w:rFonts w:ascii="Times New Roman" w:hAnsi="Times New Roman" w:cs="Times New Roman"/>
-          <w:sz w:val="24"/>
-          <w:szCs w:val="24"/>
-        </w:rPr>
-        <w:t xml:space="preserve"> </w:t>
-      </w:r>
-      <w:r>
-        <w:rPr>
-          <w:rFonts w:ascii="Times New Roman" w:hAnsi="Times New Roman" w:cs="Times New Roman"/>
-          <w:sz w:val="24"/>
-          <w:szCs w:val="24"/>
-        </w:rPr>
-        <w:t xml:space="preserve">dated </w:t>
-      </w:r>
-      <w:r>
-        <w:rPr>
-          <w:rFonts w:ascii="Times New Roman" w:hAnsi="Times New Roman" w:cs="Times New Roman"/>
-          <w:sz w:val="24"/>
-          <w:szCs w:val="24"/>
-          <w:highlight w:val="yellow"/>
-        </w:rPr>
-        <w:t xml:space="preserve">{{ </w:t>
-      </w:r>
-      <w:r>
-        <w:rPr>
-          <w:rFonts w:ascii="Times New Roman" w:hAnsi="Times New Roman" w:cs="Times New Roman"/>
-          <w:sz w:val="24"/>
-          <w:szCs w:val="24"/>
-          <w:highlight w:val="yellow"/>
-        </w:rPr>
-        <w:t>report_deadline_long</w:t>
-      </w:r>
-      <w:r>
-        <w:rPr>
-          <w:rFonts w:ascii="Times New Roman" w:hAnsi="Times New Roman" w:cs="Times New Roman"/>
-          <w:sz w:val="24"/>
-          <w:szCs w:val="24"/>
-          <w:highlight w:val="yellow"/>
-        </w:rPr>
-        <w:t xml:space="preserve"> }}</w:t>
-      </w:r>
-      <w:r>
-        <w:rPr>
-          <w:rFonts w:ascii="Times New Roman" w:hAnsi="Times New Roman" w:cs="Times New Roman"/>
-          <w:sz w:val="24"/>
-          <w:szCs w:val="24"/>
-          <w:highlight w:val="yellow"/>
-        </w:rPr>
-        <w:t>.</w:t>
-      </w:r>
-      <w:r>
-        <w:rPr>
-          <w:rFonts w:ascii="Times New Roman" w:hAnsi="Times New Roman" w:cs="Times New Roman"/>
-          <w:sz w:val="24"/>
-          <w:szCs w:val="24"/>
-        </w:rPr>
-        <w:t xml:space="preserve"> </w:t>
-      </w:r>
-      <w:r>
-        <w:rPr>
-          <w:rFonts w:ascii="Times New Roman" w:hAnsi="Times New Roman" w:cs="Times New Roman"/>
-          <w:sz w:val="24"/>
-          <w:szCs w:val="24"/>
-        </w:rPr>
-        <w:t>The plaintiff</w:t>
-      </w:r>
-      <w:r>
-        <w:rPr>
-          <w:rFonts w:ascii="Times New Roman" w:hAnsi="Times New Roman" w:cs="Times New Roman"/>
-          <w:sz w:val="24"/>
-          <w:szCs w:val="24"/>
-        </w:rPr>
-        <w:t xml:space="preserve"> will require a present value ranging from</w:t>
-      </w:r>
-      <w:r>
-        <w:rPr>
-          <w:rFonts w:ascii="Times New Roman" w:hAnsi="Times New Roman" w:cs="Times New Roman"/>
-          <w:sz w:val="24"/>
-          <w:szCs w:val="24"/>
-        </w:rPr>
-        <w:t xml:space="preserve"> </w:t>
-      </w:r>
-      <w:r>
-        <w:rPr>
-          <w:rFonts w:ascii="Times New Roman" w:hAnsi="Times New Roman" w:cs="Times New Roman"/>
-          <w:sz w:val="24"/>
-          <w:szCs w:val="24"/>
-          <w:highlight w:val="yellow"/>
-        </w:rPr>
-        <w:t xml:space="preserve">{{ </w:t>
-      </w:r>
-      <w:r>
-        <w:rPr>
-          <w:rFonts w:ascii="Times New Roman" w:hAnsi="Times New Roman" w:cs="Times New Roman"/>
-          <w:sz w:val="24"/>
-          <w:szCs w:val="24"/>
-          <w:highlight w:val="yellow"/>
-        </w:rPr>
-        <w:t>estimate_lower_bound</w:t>
-      </w:r>
-      <w:r>
-        <w:rPr>
-          <w:rFonts w:ascii="Times New Roman" w:hAnsi="Times New Roman" w:cs="Times New Roman"/>
-          <w:sz w:val="24"/>
-          <w:szCs w:val="24"/>
-          <w:highlight w:val="yellow"/>
-        </w:rPr>
-        <w:t xml:space="preserve"> }}</w:t>
-      </w:r>
-      <w:r>
-        <w:rPr>
-          <w:rFonts w:ascii="Times New Roman" w:hAnsi="Times New Roman" w:cs="Times New Roman"/>
-          <w:sz w:val="24"/>
-          <w:szCs w:val="24"/>
-        </w:rPr>
-        <w:t xml:space="preserve"> </w:t>
-      </w:r>
-      <w:r>
-        <w:rPr>
-          <w:rFonts w:ascii="Times New Roman" w:hAnsi="Times New Roman" w:cs="Times New Roman"/>
-          <w:sz w:val="24"/>
-          <w:szCs w:val="24"/>
-        </w:rPr>
-        <w:t xml:space="preserve">to </w:t>
-      </w:r>
-      <w:r>
-        <w:rPr>
-          <w:rFonts w:ascii="Times New Roman" w:hAnsi="Times New Roman" w:cs="Times New Roman"/>
-          <w:sz w:val="24"/>
-          <w:szCs w:val="24"/>
-          <w:highlight w:val="yellow"/>
-        </w:rPr>
-        <w:t xml:space="preserve">{{ </w:t>
-      </w:r>
-      <w:r>
-        <w:rPr>
-          <w:rFonts w:ascii="Times New Roman" w:hAnsi="Times New Roman" w:cs="Times New Roman"/>
-          <w:sz w:val="24"/>
-          <w:szCs w:val="24"/>
-          <w:highlight w:val="yellow"/>
-        </w:rPr>
-        <w:t>estimate_upper_bound</w:t>
+        </w:rPr>
+        <w:t>WC_CPI_onetime_cost_high</w:t>
       </w:r>
       <w:r>
         <w:rPr>
@@ -977,7 +1001,7 @@
           <w:sz w:val="24"/>
           <w:szCs w:val="24"/>
         </w:rPr>
-        <w:t>life_expectancy</w:t>
+        <w:t>claimant_LE</w:t>
       </w:r>
       <w:r>
         <w:rPr>
@@ -1496,7 +1520,7 @@
           <w:szCs w:val="24"/>
           <w:highlight w:val="red"/>
         </w:rPr>
-        <w:t>WC_disc_rate_lower</w:t>
+        <w:t>WC_disc_rate_low</w:t>
       </w:r>
       <w:r>
         <w:rPr>
@@ -1531,7 +1555,7 @@
           <w:szCs w:val="24"/>
           <w:highlight w:val="red"/>
         </w:rPr>
-        <w:t>WC_disc_rate_higher</w:t>
+        <w:t>WC_disc_rate_high</w:t>
       </w:r>
       <w:r>
         <w:rPr>
@@ -1772,6 +1796,7 @@
           <w:rFonts w:ascii="Times New Roman" w:hAnsi="Times New Roman" w:cs="Times New Roman"/>
           <w:sz w:val="24"/>
           <w:szCs w:val="24"/>
+          <w:highlight w:val="red"/>
         </w:rPr>
         <w:t xml:space="preserve">{{ </w:t>
       </w:r>
@@ -1780,6 +1805,7 @@
           <w:rFonts w:ascii="Times New Roman" w:hAnsi="Times New Roman" w:cs="Times New Roman"/>
           <w:sz w:val="24"/>
           <w:szCs w:val="24"/>
+          <w:highlight w:val="red"/>
         </w:rPr>
         <w:t>WC_CPI_year_high</w:t>
       </w:r>
@@ -1788,6 +1814,7 @@
           <w:rFonts w:ascii="Times New Roman" w:hAnsi="Times New Roman" w:cs="Times New Roman"/>
           <w:sz w:val="24"/>
           <w:szCs w:val="24"/>
+          <w:highlight w:val="red"/>
         </w:rPr>
         <w:t xml:space="preserve"> }}</w:t>
       </w:r>
@@ -2552,14 +2579,21 @@
           <w:sz w:val="24"/>
           <w:szCs w:val="24"/>
         </w:rPr>
-        <w:t xml:space="preserve"> to the items and services contained within the report received from </w:t>
-      </w:r>
-      <w:r>
-        <w:rPr>
-          <w:rFonts w:ascii="Times New Roman" w:hAnsi="Times New Roman" w:cs="Times New Roman"/>
-          <w:sz w:val="24"/>
-          <w:szCs w:val="24"/>
-          <w:highlight w:val="yellow"/>
+        <w:t xml:space="preserve"> to the items and services contained within the report received </w:t>
+      </w:r>
+      <w:r>
+        <w:rPr>
+          <w:rFonts w:ascii="Times New Roman" w:hAnsi="Times New Roman" w:cs="Times New Roman"/>
+          <w:sz w:val="24"/>
+          <w:szCs w:val="24"/>
+        </w:rPr>
+        <w:t xml:space="preserve">from </w:t>
+      </w:r>
+      <w:r>
+        <w:rPr>
+          <w:rFonts w:ascii="Times New Roman" w:hAnsi="Times New Roman" w:cs="Times New Roman"/>
+          <w:sz w:val="24"/>
+          <w:szCs w:val="24"/>
         </w:rPr>
         <w:t xml:space="preserve">{{ </w:t>
       </w:r>
@@ -2568,7 +2602,6 @@
           <w:rFonts w:ascii="Times New Roman" w:hAnsi="Times New Roman" w:cs="Times New Roman"/>
           <w:sz w:val="24"/>
           <w:szCs w:val="24"/>
-          <w:highlight w:val="yellow"/>
         </w:rPr>
         <w:t>LCP_</w:t>
       </w:r>
@@ -2577,7 +2610,6 @@
           <w:rFonts w:ascii="Times New Roman" w:hAnsi="Times New Roman" w:cs="Times New Roman"/>
           <w:sz w:val="24"/>
           <w:szCs w:val="24"/>
-          <w:highlight w:val="yellow"/>
         </w:rPr>
         <w:t>expert</w:t>
       </w:r>
@@ -2586,7 +2618,6 @@
           <w:rFonts w:ascii="Times New Roman" w:hAnsi="Times New Roman" w:cs="Times New Roman"/>
           <w:sz w:val="24"/>
           <w:szCs w:val="24"/>
-          <w:highlight w:val="yellow"/>
         </w:rPr>
         <w:t xml:space="preserve"> }}</w:t>
       </w:r>
@@ -8076,23 +8107,10 @@
 </file>
 
 <file path=customXml/item1.xml><?xml version="1.0" encoding="utf-8"?>
-<p:properties xmlns:p="http://schemas.microsoft.com/office/2006/metadata/properties" xmlns:xsi="http://www.w3.org/2001/XMLSchema-instance" xmlns:pc="http://schemas.microsoft.com/office/infopath/2007/PartnerControls">
-  <documentManagement>
-    <_activity xmlns="91172594-76f2-42b4-b6c8-5686d13fb17f" xsi:nil="true"/>
-  </documentManagement>
-</p:properties>
+<b:Sources xmlns:b="http://schemas.openxmlformats.org/officeDocument/2006/bibliography" xmlns="http://schemas.openxmlformats.org/officeDocument/2006/bibliography" SelectedStyle="\APASixthEditionOfficeOnline.xsl" StyleName="APA" Version="6"/>
 </file>
 
 <file path=customXml/item2.xml><?xml version="1.0" encoding="utf-8"?>
-<?mso-contentType ?>
-<FormTemplates xmlns="http://schemas.microsoft.com/sharepoint/v3/contenttype/forms">
-  <Display>DocumentLibraryForm</Display>
-  <Edit>DocumentLibraryForm</Edit>
-  <New>DocumentLibraryForm</New>
-</FormTemplates>
-</file>
-
-<file path=customXml/item3.xml><?xml version="1.0" encoding="utf-8"?>
 <ct:contentTypeSchema xmlns:ct="http://schemas.microsoft.com/office/2006/metadata/contentType" xmlns:ma="http://schemas.microsoft.com/office/2006/metadata/properties/metaAttributes" ct:_="" ma:_="" ma:contentTypeName="Document" ma:contentTypeID="0x010100085B5888F14DAE46912A6E0F6FCFCB07" ma:contentTypeVersion="9" ma:contentTypeDescription="Create a new document." ma:contentTypeScope="" ma:versionID="2185b18d6fd5c46c37ca5df071e41de6">
   <xsd:schema xmlns:xsd="http://www.w3.org/2001/XMLSchema" xmlns:xs="http://www.w3.org/2001/XMLSchema" xmlns:p="http://schemas.microsoft.com/office/2006/metadata/properties" xmlns:ns3="91172594-76f2-42b4-b6c8-5686d13fb17f" targetNamespace="http://schemas.microsoft.com/office/2006/metadata/properties" ma:root="true" ma:fieldsID="3ce95284eb097024ce56720a48b923a2" ns3:_="">
     <xsd:import namespace="91172594-76f2-42b4-b6c8-5686d13fb17f"/>
@@ -8268,29 +8286,32 @@
 </ct:contentTypeSchema>
 </file>
 
+<file path=customXml/item3.xml><?xml version="1.0" encoding="utf-8"?>
+<?mso-contentType ?>
+<FormTemplates xmlns="http://schemas.microsoft.com/sharepoint/v3/contenttype/forms">
+  <Display>DocumentLibraryForm</Display>
+  <Edit>DocumentLibraryForm</Edit>
+  <New>DocumentLibraryForm</New>
+</FormTemplates>
+</file>
+
 <file path=customXml/item4.xml><?xml version="1.0" encoding="utf-8"?>
-<b:Sources xmlns:b="http://schemas.openxmlformats.org/officeDocument/2006/bibliography" xmlns="http://schemas.openxmlformats.org/officeDocument/2006/bibliography" SelectedStyle="\APASixthEditionOfficeOnline.xsl" StyleName="APA" Version="6"/>
+<p:properties xmlns:p="http://schemas.microsoft.com/office/2006/metadata/properties" xmlns:xsi="http://www.w3.org/2001/XMLSchema-instance" xmlns:pc="http://schemas.microsoft.com/office/infopath/2007/PartnerControls">
+  <documentManagement>
+    <_activity xmlns="91172594-76f2-42b4-b6c8-5686d13fb17f" xsi:nil="true"/>
+  </documentManagement>
+</p:properties>
 </file>
 
 <file path=customXml/itemProps1.xml><?xml version="1.0" encoding="utf-8"?>
-<ds:datastoreItem xmlns:ds="http://schemas.openxmlformats.org/officeDocument/2006/customXml" ds:itemID="{B4565CB4-100A-4A3D-B4D6-384A4DEF81CB}">
+<ds:datastoreItem xmlns:ds="http://schemas.openxmlformats.org/officeDocument/2006/customXml" ds:itemID="{FCC1ACD0-7293-47C9-BE0B-4D879715608C}">
   <ds:schemaRefs>
-    <ds:schemaRef ds:uri="http://schemas.microsoft.com/office/2006/metadata/properties"/>
-    <ds:schemaRef ds:uri="http://schemas.microsoft.com/office/infopath/2007/PartnerControls"/>
-    <ds:schemaRef ds:uri="91172594-76f2-42b4-b6c8-5686d13fb17f"/>
+    <ds:schemaRef ds:uri="http://schemas.openxmlformats.org/officeDocument/2006/bibliography"/>
   </ds:schemaRefs>
 </ds:datastoreItem>
 </file>
 
 <file path=customXml/itemProps2.xml><?xml version="1.0" encoding="utf-8"?>
-<ds:datastoreItem xmlns:ds="http://schemas.openxmlformats.org/officeDocument/2006/customXml" ds:itemID="{510AB3BD-BC06-4C1C-BE0E-F78D828DF9A1}">
-  <ds:schemaRefs>
-    <ds:schemaRef ds:uri="http://schemas.microsoft.com/sharepoint/v3/contenttype/forms"/>
-  </ds:schemaRefs>
-</ds:datastoreItem>
-</file>
-
-<file path=customXml/itemProps3.xml><?xml version="1.0" encoding="utf-8"?>
 <ds:datastoreItem xmlns:ds="http://schemas.openxmlformats.org/officeDocument/2006/customXml" ds:itemID="{8A7A12AC-3EA6-42CF-BE43-5DF49F85A7B6}">
   <ds:schemaRefs>
     <ds:schemaRef ds:uri="http://schemas.microsoft.com/office/2006/metadata/contentType"/>
@@ -8308,10 +8329,20 @@
 </ds:datastoreItem>
 </file>
 
+<file path=customXml/itemProps3.xml><?xml version="1.0" encoding="utf-8"?>
+<ds:datastoreItem xmlns:ds="http://schemas.openxmlformats.org/officeDocument/2006/customXml" ds:itemID="{510AB3BD-BC06-4C1C-BE0E-F78D828DF9A1}">
+  <ds:schemaRefs>
+    <ds:schemaRef ds:uri="http://schemas.microsoft.com/sharepoint/v3/contenttype/forms"/>
+  </ds:schemaRefs>
+</ds:datastoreItem>
+</file>
+
 <file path=customXml/itemProps4.xml><?xml version="1.0" encoding="utf-8"?>
-<ds:datastoreItem xmlns:ds="http://schemas.openxmlformats.org/officeDocument/2006/customXml" ds:itemID="{FCC1ACD0-7293-47C9-BE0B-4D879715608C}">
+<ds:datastoreItem xmlns:ds="http://schemas.openxmlformats.org/officeDocument/2006/customXml" ds:itemID="{B4565CB4-100A-4A3D-B4D6-384A4DEF81CB}">
   <ds:schemaRefs>
-    <ds:schemaRef ds:uri="http://schemas.openxmlformats.org/officeDocument/2006/bibliography"/>
+    <ds:schemaRef ds:uri="http://schemas.microsoft.com/office/2006/metadata/properties"/>
+    <ds:schemaRef ds:uri="http://schemas.microsoft.com/office/infopath/2007/PartnerControls"/>
+    <ds:schemaRef ds:uri="91172594-76f2-42b4-b6c8-5686d13fb17f"/>
   </ds:schemaRefs>
 </ds:datastoreItem>
 </file>
</xml_diff>

<commit_message>
Continued report template review with CJ
</commit_message>
<xml_diff>
--- a/EconAutomation/src/supporting_docs/econ_report_templates/PVLCP_report_template.docx
+++ b/EconAutomation/src/supporting_docs/econ_report_templates/PVLCP_report_template.docx
@@ -51,7 +51,7 @@
           <w:sz w:val="24"/>
           <w:szCs w:val="24"/>
         </w:rPr>
-        <w:t>May 1, 2026</w:t>
+        <w:t>May 7, 2026</w:t>
       </w:r>
       <w:r>
         <w:rPr>
@@ -550,6 +550,14 @@
           <w:sz w:val="24"/>
           <w:szCs w:val="24"/>
         </w:rPr>
+        <w:t xml:space="preserve"> (or MCP)</w:t>
+      </w:r>
+      <w:r>
+        <w:rPr>
+          <w:rFonts w:ascii="Times New Roman" w:hAnsi="Times New Roman" w:cs="Times New Roman"/>
+          <w:sz w:val="24"/>
+          <w:szCs w:val="24"/>
+        </w:rPr>
         <w:t xml:space="preserve"> from </w:t>
       </w:r>
       <w:r>
@@ -653,13 +661,23 @@
           <w:sz w:val="24"/>
           <w:szCs w:val="24"/>
         </w:rPr>
-        <w:t>The plaintiff</w:t>
-      </w:r>
-      <w:r>
-        <w:rPr>
-          <w:rFonts w:ascii="Times New Roman" w:hAnsi="Times New Roman" w:cs="Times New Roman"/>
-          <w:sz w:val="24"/>
-          <w:szCs w:val="24"/>
+        <w:t xml:space="preserve">The </w:t>
+      </w:r>
+      <w:r>
+        <w:rPr>
+          <w:rFonts w:ascii="Times New Roman" w:hAnsi="Times New Roman" w:cs="Times New Roman"/>
+          <w:sz w:val="24"/>
+          <w:szCs w:val="24"/>
+          <w:highlight w:val="red"/>
+        </w:rPr>
+        <w:t>plaintiff</w:t>
+      </w:r>
+      <w:r>
+        <w:rPr>
+          <w:rFonts w:ascii="Times New Roman" w:hAnsi="Times New Roman" w:cs="Times New Roman"/>
+          <w:sz w:val="24"/>
+          <w:szCs w:val="24"/>
+          <w:highlight w:val="red"/>
         </w:rPr>
         <w:t xml:space="preserve"> will require a present value ranging from</w:t>
       </w:r>
@@ -668,6 +686,7 @@
           <w:rFonts w:ascii="Times New Roman" w:hAnsi="Times New Roman" w:cs="Times New Roman"/>
           <w:sz w:val="24"/>
           <w:szCs w:val="24"/>
+          <w:highlight w:val="red"/>
         </w:rPr>
         <w:t xml:space="preserve"> </w:t>
       </w:r>
@@ -676,7 +695,7 @@
           <w:rFonts w:ascii="Times New Roman" w:hAnsi="Times New Roman" w:cs="Times New Roman"/>
           <w:sz w:val="24"/>
           <w:szCs w:val="24"/>
-          <w:highlight w:val="yellow"/>
+          <w:highlight w:val="red"/>
         </w:rPr>
         <w:t xml:space="preserve">{{ </w:t>
       </w:r>
@@ -685,15 +704,16 @@
           <w:rFonts w:ascii="Times New Roman" w:hAnsi="Times New Roman" w:cs="Times New Roman"/>
           <w:sz w:val="24"/>
           <w:szCs w:val="24"/>
-        </w:rPr>
-        <w:t>WC_CPI_onetime_cost_low</w:t>
-      </w:r>
-      <w:r>
-        <w:rPr>
-          <w:rFonts w:ascii="Times New Roman" w:hAnsi="Times New Roman" w:cs="Times New Roman"/>
-          <w:sz w:val="24"/>
-          <w:szCs w:val="24"/>
-          <w:highlight w:val="yellow"/>
+          <w:highlight w:val="red"/>
+        </w:rPr>
+        <w:t>PV_Summary_No_Rounding_Total_Low</w:t>
+      </w:r>
+      <w:r>
+        <w:rPr>
+          <w:rFonts w:ascii="Times New Roman" w:hAnsi="Times New Roman" w:cs="Times New Roman"/>
+          <w:sz w:val="24"/>
+          <w:szCs w:val="24"/>
+          <w:highlight w:val="red"/>
         </w:rPr>
         <w:t xml:space="preserve"> }}</w:t>
       </w:r>
@@ -702,6 +722,7 @@
           <w:rFonts w:ascii="Times New Roman" w:hAnsi="Times New Roman" w:cs="Times New Roman"/>
           <w:sz w:val="24"/>
           <w:szCs w:val="24"/>
+          <w:highlight w:val="red"/>
         </w:rPr>
         <w:t xml:space="preserve"> </w:t>
       </w:r>
@@ -710,6 +731,7 @@
           <w:rFonts w:ascii="Times New Roman" w:hAnsi="Times New Roman" w:cs="Times New Roman"/>
           <w:sz w:val="24"/>
           <w:szCs w:val="24"/>
+          <w:highlight w:val="red"/>
         </w:rPr>
         <w:t xml:space="preserve">to </w:t>
       </w:r>
@@ -718,7 +740,7 @@
           <w:rFonts w:ascii="Times New Roman" w:hAnsi="Times New Roman" w:cs="Times New Roman"/>
           <w:sz w:val="24"/>
           <w:szCs w:val="24"/>
-          <w:highlight w:val="yellow"/>
+          <w:highlight w:val="red"/>
         </w:rPr>
         <w:t xml:space="preserve">{{ </w:t>
       </w:r>
@@ -727,15 +749,25 @@
           <w:rFonts w:ascii="Times New Roman" w:hAnsi="Times New Roman" w:cs="Times New Roman"/>
           <w:sz w:val="24"/>
           <w:szCs w:val="24"/>
-        </w:rPr>
-        <w:t>WC_CPI_onetime_cost_high</w:t>
-      </w:r>
-      <w:r>
-        <w:rPr>
-          <w:rFonts w:ascii="Times New Roman" w:hAnsi="Times New Roman" w:cs="Times New Roman"/>
-          <w:sz w:val="24"/>
-          <w:szCs w:val="24"/>
-          <w:highlight w:val="yellow"/>
+          <w:highlight w:val="red"/>
+        </w:rPr>
+        <w:t>PV_Summary_No_Rounding_Total_</w:t>
+      </w:r>
+      <w:r>
+        <w:rPr>
+          <w:rFonts w:ascii="Times New Roman" w:hAnsi="Times New Roman" w:cs="Times New Roman"/>
+          <w:sz w:val="24"/>
+          <w:szCs w:val="24"/>
+          <w:highlight w:val="red"/>
+        </w:rPr>
+        <w:t>High</w:t>
+      </w:r>
+      <w:r>
+        <w:rPr>
+          <w:rFonts w:ascii="Times New Roman" w:hAnsi="Times New Roman" w:cs="Times New Roman"/>
+          <w:sz w:val="24"/>
+          <w:szCs w:val="24"/>
+          <w:highlight w:val="red"/>
         </w:rPr>
         <w:t xml:space="preserve"> }}</w:t>
       </w:r>
@@ -744,6 +776,7 @@
           <w:rFonts w:ascii="Times New Roman" w:hAnsi="Times New Roman" w:cs="Times New Roman"/>
           <w:sz w:val="24"/>
           <w:szCs w:val="24"/>
+          <w:highlight w:val="red"/>
         </w:rPr>
         <w:t xml:space="preserve"> </w:t>
       </w:r>
@@ -752,22 +785,16 @@
           <w:rFonts w:ascii="Times New Roman" w:hAnsi="Times New Roman" w:cs="Times New Roman"/>
           <w:sz w:val="24"/>
           <w:szCs w:val="24"/>
-        </w:rPr>
-        <w:t>in</w:t>
-      </w:r>
-      <w:r>
-        <w:rPr>
-          <w:rFonts w:ascii="Times New Roman" w:hAnsi="Times New Roman" w:cs="Times New Roman"/>
-          <w:sz w:val="24"/>
-          <w:szCs w:val="24"/>
-        </w:rPr>
-        <w:t xml:space="preserve"> order to fund future medical </w:t>
-      </w:r>
-      <w:r>
-        <w:rPr>
-          <w:rFonts w:ascii="Times New Roman" w:hAnsi="Times New Roman" w:cs="Times New Roman"/>
-          <w:sz w:val="24"/>
-          <w:szCs w:val="24"/>
+          <w:highlight w:val="red"/>
+        </w:rPr>
+        <w:t xml:space="preserve">in order to fund future medical </w:t>
+      </w:r>
+      <w:r>
+        <w:rPr>
+          <w:rFonts w:ascii="Times New Roman" w:hAnsi="Times New Roman" w:cs="Times New Roman"/>
+          <w:sz w:val="24"/>
+          <w:szCs w:val="24"/>
+          <w:highlight w:val="red"/>
         </w:rPr>
         <w:t>care,</w:t>
       </w:r>
@@ -776,6 +803,7 @@
           <w:rFonts w:ascii="Times New Roman" w:hAnsi="Times New Roman" w:cs="Times New Roman"/>
           <w:sz w:val="24"/>
           <w:szCs w:val="24"/>
+          <w:highlight w:val="red"/>
         </w:rPr>
         <w:t xml:space="preserve"> depending on realized costs. The midpoint </w:t>
       </w:r>
@@ -785,6 +813,7 @@
           <w:spacing w:val="-10"/>
           <w:sz w:val="24"/>
           <w:szCs w:val="24"/>
+          <w:highlight w:val="red"/>
         </w:rPr>
         <w:t>is</w:t>
       </w:r>
@@ -794,6 +823,7 @@
           <w:spacing w:val="-10"/>
           <w:sz w:val="24"/>
           <w:szCs w:val="24"/>
+          <w:highlight w:val="red"/>
         </w:rPr>
         <w:t xml:space="preserve"> </w:t>
       </w:r>
@@ -803,7 +833,7 @@
           <w:spacing w:val="-10"/>
           <w:sz w:val="24"/>
           <w:szCs w:val="24"/>
-          <w:highlight w:val="yellow"/>
+          <w:highlight w:val="red"/>
         </w:rPr>
         <w:t xml:space="preserve">{{ </w:t>
       </w:r>
@@ -813,9 +843,9 @@
           <w:spacing w:val="-10"/>
           <w:sz w:val="24"/>
           <w:szCs w:val="24"/>
-          <w:highlight w:val="yellow"/>
-        </w:rPr>
-        <w:t>estimate_midpoint</w:t>
+          <w:highlight w:val="red"/>
+        </w:rPr>
+        <w:t>PV_Summary_No_Rounding_Total_</w:t>
       </w:r>
       <w:r>
         <w:rPr>
@@ -823,7 +853,17 @@
           <w:spacing w:val="-10"/>
           <w:sz w:val="24"/>
           <w:szCs w:val="24"/>
-          <w:highlight w:val="yellow"/>
+          <w:highlight w:val="red"/>
+        </w:rPr>
+        <w:t>Mid</w:t>
+      </w:r>
+      <w:r>
+        <w:rPr>
+          <w:rFonts w:ascii="Times New Roman" w:hAnsi="Times New Roman" w:cs="Times New Roman"/>
+          <w:spacing w:val="-10"/>
+          <w:sz w:val="24"/>
+          <w:szCs w:val="24"/>
+          <w:highlight w:val="red"/>
         </w:rPr>
         <w:t xml:space="preserve"> }}</w:t>
       </w:r>
@@ -833,6 +873,7 @@
           <w:spacing w:val="-10"/>
           <w:sz w:val="24"/>
           <w:szCs w:val="24"/>
+          <w:highlight w:val="red"/>
         </w:rPr>
         <w:t>.</w:t>
       </w:r>
@@ -841,6 +882,7 @@
           <w:rFonts w:ascii="Times New Roman" w:hAnsi="Times New Roman" w:cs="Times New Roman"/>
           <w:sz w:val="24"/>
           <w:szCs w:val="24"/>
+          <w:highlight w:val="red"/>
         </w:rPr>
         <w:t xml:space="preserve"> Present values and the itemized tables that follow incorporate the economic variables necessary to properly account for the time value of money:</w:t>
       </w:r>
@@ -992,6 +1034,7 @@
           <w:rFonts w:ascii="Times New Roman" w:hAnsi="Times New Roman" w:cs="Times New Roman"/>
           <w:sz w:val="24"/>
           <w:szCs w:val="24"/>
+          <w:highlight w:val="red"/>
         </w:rPr>
         <w:t xml:space="preserve">{{ </w:t>
       </w:r>
@@ -1000,6 +1043,7 @@
           <w:rFonts w:ascii="Times New Roman" w:hAnsi="Times New Roman" w:cs="Times New Roman"/>
           <w:sz w:val="24"/>
           <w:szCs w:val="24"/>
+          <w:highlight w:val="red"/>
         </w:rPr>
         <w:t>claimant_LE</w:t>
       </w:r>
@@ -1008,6 +1052,16 @@
           <w:rFonts w:ascii="Times New Roman" w:hAnsi="Times New Roman" w:cs="Times New Roman"/>
           <w:sz w:val="24"/>
           <w:szCs w:val="24"/>
+          <w:highlight w:val="red"/>
+        </w:rPr>
+        <w:t>_from_trial</w:t>
+      </w:r>
+      <w:r>
+        <w:rPr>
+          <w:rFonts w:ascii="Times New Roman" w:hAnsi="Times New Roman" w:cs="Times New Roman"/>
+          <w:sz w:val="24"/>
+          <w:szCs w:val="24"/>
+          <w:highlight w:val="red"/>
         </w:rPr>
         <w:t xml:space="preserve"> }}</w:t>
       </w:r>
@@ -1120,6 +1174,14 @@
           <w:sz w:val="24"/>
           <w:szCs w:val="24"/>
         </w:rPr>
+        <w:t xml:space="preserve"> (or MCP)</w:t>
+      </w:r>
+      <w:r>
+        <w:rPr>
+          <w:rFonts w:ascii="Times New Roman" w:hAnsi="Times New Roman" w:cs="Times New Roman"/>
+          <w:sz w:val="24"/>
+          <w:szCs w:val="24"/>
+        </w:rPr>
         <w:t>.</w:t>
       </w:r>
       <w:r>
@@ -1191,6 +1253,43 @@
           <w:szCs w:val="24"/>
           <w:highlight w:val="yellow"/>
         </w:rPr>
+        <w:t xml:space="preserve"> </w:t>
+      </w:r>
+      <w:r>
+        <w:rPr>
+          <w:rFonts w:ascii="Times New Roman" w:hAnsi="Times New Roman" w:cs="Times New Roman"/>
+          <w:sz w:val="24"/>
+          <w:szCs w:val="24"/>
+          <w:highlight w:val="red"/>
+        </w:rPr>
+        <w:t>(rounded to 1</w:t>
+      </w:r>
+      <w:r>
+        <w:rPr>
+          <w:rFonts w:ascii="Times New Roman" w:hAnsi="Times New Roman" w:cs="Times New Roman"/>
+          <w:sz w:val="24"/>
+          <w:szCs w:val="24"/>
+          <w:highlight w:val="red"/>
+          <w:vertAlign w:val="superscript"/>
+        </w:rPr>
+        <w:t>st</w:t>
+      </w:r>
+      <w:r>
+        <w:rPr>
+          <w:rFonts w:ascii="Times New Roman" w:hAnsi="Times New Roman" w:cs="Times New Roman"/>
+          <w:sz w:val="24"/>
+          <w:szCs w:val="24"/>
+          <w:highlight w:val="red"/>
+        </w:rPr>
+        <w:t xml:space="preserve"> of month)</w:t>
+      </w:r>
+      <w:r>
+        <w:rPr>
+          <w:rFonts w:ascii="Times New Roman" w:hAnsi="Times New Roman" w:cs="Times New Roman"/>
+          <w:sz w:val="24"/>
+          <w:szCs w:val="24"/>
+          <w:highlight w:val="yellow"/>
+        </w:rPr>
         <w:t>.</w:t>
       </w:r>
       <w:r>
@@ -1424,8 +1523,9 @@
           <w:szCs w:val="24"/>
           <w:highlight w:val="green"/>
         </w:rPr>
-        <w:t>For maturities greater than 30 years</w:t>
-      </w:r>
+        <w:t xml:space="preserve">For </w:t>
+      </w:r>
+      <w:commentRangeStart w:id="0"/>
       <w:r>
         <w:rPr>
           <w:rFonts w:ascii="Times New Roman" w:hAnsi="Times New Roman" w:cs="Times New Roman"/>
@@ -1433,6 +1533,35 @@
           <w:szCs w:val="24"/>
           <w:highlight w:val="green"/>
         </w:rPr>
+        <w:t xml:space="preserve">maturities </w:t>
+      </w:r>
+      <w:commentRangeEnd w:id="0"/>
+      <w:r>
+        <w:rPr>
+          <w:rStyle w:val="CommentReference"/>
+          <w:rFonts w:ascii="Times New Roman" w:hAnsi="Times New Roman" w:cs="Times New Roman"/>
+          <w:sz w:val="24"/>
+          <w:szCs w:val="24"/>
+          <w:highlight w:val="green"/>
+        </w:rPr>
+        <w:commentReference w:id="0"/>
+      </w:r>
+      <w:r>
+        <w:rPr>
+          <w:rFonts w:ascii="Times New Roman" w:hAnsi="Times New Roman" w:cs="Times New Roman"/>
+          <w:sz w:val="24"/>
+          <w:szCs w:val="24"/>
+          <w:highlight w:val="green"/>
+        </w:rPr>
+        <w:t>greater than 30 years</w:t>
+      </w:r>
+      <w:r>
+        <w:rPr>
+          <w:rFonts w:ascii="Times New Roman" w:hAnsi="Times New Roman" w:cs="Times New Roman"/>
+          <w:sz w:val="24"/>
+          <w:szCs w:val="24"/>
+          <w:highlight w:val="green"/>
+        </w:rPr>
         <w:t>, I use the longest available maturity of</w:t>
       </w:r>
       <w:r>
@@ -1452,7 +1581,7 @@
         </w:rPr>
         <w:t>{</w:t>
       </w:r>
-      <w:commentRangeStart w:id="0"/>
+      <w:commentRangeStart w:id="1"/>
       <w:r>
         <w:rPr>
           <w:rFonts w:ascii="Times New Roman" w:hAnsi="Times New Roman" w:cs="Times New Roman"/>
@@ -1520,7 +1649,7 @@
           <w:szCs w:val="24"/>
           <w:highlight w:val="red"/>
         </w:rPr>
-        <w:t>WC_disc_rate_low</w:t>
+        <w:t>WC_disc_rate_</w:t>
       </w:r>
       <w:r>
         <w:rPr>
@@ -1529,6 +1658,15 @@
           <w:szCs w:val="24"/>
           <w:highlight w:val="red"/>
         </w:rPr>
+        <w:t>min</w:t>
+      </w:r>
+      <w:r>
+        <w:rPr>
+          <w:rFonts w:ascii="Times New Roman" w:hAnsi="Times New Roman" w:cs="Times New Roman"/>
+          <w:sz w:val="24"/>
+          <w:szCs w:val="24"/>
+          <w:highlight w:val="red"/>
+        </w:rPr>
         <w:t xml:space="preserve"> }}</w:t>
       </w:r>
       <w:r>
@@ -1555,7 +1693,7 @@
           <w:szCs w:val="24"/>
           <w:highlight w:val="red"/>
         </w:rPr>
-        <w:t>WC_disc_rate_high</w:t>
+        <w:t>WC_disc_rate_</w:t>
       </w:r>
       <w:r>
         <w:rPr>
@@ -1564,6 +1702,15 @@
           <w:szCs w:val="24"/>
           <w:highlight w:val="red"/>
         </w:rPr>
+        <w:t>max</w:t>
+      </w:r>
+      <w:r>
+        <w:rPr>
+          <w:rFonts w:ascii="Times New Roman" w:hAnsi="Times New Roman" w:cs="Times New Roman"/>
+          <w:sz w:val="24"/>
+          <w:szCs w:val="24"/>
+          <w:highlight w:val="red"/>
+        </w:rPr>
         <w:t xml:space="preserve"> }}</w:t>
       </w:r>
       <w:r>
@@ -1574,7 +1721,7 @@
         </w:rPr>
         <w:t>.</w:t>
       </w:r>
-      <w:commentRangeEnd w:id="0"/>
+      <w:commentRangeEnd w:id="1"/>
       <w:r>
         <w:rPr>
           <w:rStyle w:val="CommentReference"/>
@@ -1583,23 +1730,24 @@
           <w:szCs w:val="24"/>
           <w:highlight w:val="yellow"/>
         </w:rPr>
-        <w:commentReference w:id="0"/>
-      </w:r>
-    </w:p>
-    <w:p>
-      <w:pPr>
-        <w:rPr>
-          <w:rFonts w:ascii="Times New Roman" w:hAnsi="Times New Roman" w:cs="Times New Roman"/>
-          <w:sz w:val="24"/>
-          <w:szCs w:val="24"/>
-        </w:rPr>
-      </w:pPr>
-      <w:r>
-        <w:rPr>
-          <w:rFonts w:ascii="Times New Roman" w:hAnsi="Times New Roman" w:cs="Times New Roman"/>
-          <w:sz w:val="24"/>
-          <w:szCs w:val="24"/>
-        </w:rPr>
+        <w:commentReference w:id="1"/>
+      </w:r>
+    </w:p>
+    <w:p>
+      <w:pPr>
+        <w:rPr>
+          <w:rFonts w:ascii="Times New Roman" w:hAnsi="Times New Roman" w:cs="Times New Roman"/>
+          <w:sz w:val="24"/>
+          <w:szCs w:val="24"/>
+        </w:rPr>
+      </w:pPr>
+      <w:r>
+        <w:rPr>
+          <w:rFonts w:ascii="Times New Roman" w:hAnsi="Times New Roman" w:cs="Times New Roman"/>
+          <w:sz w:val="24"/>
+          <w:szCs w:val="24"/>
+        </w:rPr>
+        <w:lastRenderedPageBreak/>
         <w:br w:type="page"/>
       </w:r>
     </w:p>
@@ -1721,7 +1869,7 @@
         </w:rPr>
         <w:t xml:space="preserve">ve average historic growth rates are calculated for the indicated categories and are applied throughout the analysis. </w:t>
       </w:r>
-      <w:bookmarkStart w:id="1" w:name="_Hlk211350200"/>
+      <w:bookmarkStart w:id="2" w:name="_Hlk211350200"/>
       <w:r>
         <w:rPr>
           <w:rFonts w:ascii="Times New Roman" w:hAnsi="Times New Roman" w:cs="Times New Roman"/>
@@ -1759,7 +1907,6 @@
           <w:rFonts w:ascii="Times New Roman" w:hAnsi="Times New Roman" w:cs="Times New Roman"/>
           <w:sz w:val="24"/>
           <w:szCs w:val="24"/>
-          <w:highlight w:val="red"/>
         </w:rPr>
         <w:t xml:space="preserve">{{ </w:t>
       </w:r>
@@ -1768,16 +1915,14 @@
           <w:rFonts w:ascii="Times New Roman" w:hAnsi="Times New Roman" w:cs="Times New Roman"/>
           <w:sz w:val="24"/>
           <w:szCs w:val="24"/>
-          <w:highlight w:val="red"/>
-        </w:rPr>
-        <w:t>WC_CPI_year_low</w:t>
-      </w:r>
-      <w:r>
-        <w:rPr>
-          <w:rFonts w:ascii="Times New Roman" w:hAnsi="Times New Roman" w:cs="Times New Roman"/>
-          <w:sz w:val="24"/>
-          <w:szCs w:val="24"/>
-          <w:highlight w:val="red"/>
+        </w:rPr>
+        <w:t>WC_CPI_duration_min</w:t>
+      </w:r>
+      <w:r>
+        <w:rPr>
+          <w:rFonts w:ascii="Times New Roman" w:hAnsi="Times New Roman" w:cs="Times New Roman"/>
+          <w:sz w:val="24"/>
+          <w:szCs w:val="24"/>
         </w:rPr>
         <w:t xml:space="preserve"> }}</w:t>
       </w:r>
@@ -1786,17 +1931,15 @@
           <w:rFonts w:ascii="Times New Roman" w:hAnsi="Times New Roman" w:cs="Times New Roman"/>
           <w:sz w:val="24"/>
           <w:szCs w:val="24"/>
-          <w:highlight w:val="red"/>
         </w:rPr>
         <w:t xml:space="preserve"> to </w:t>
       </w:r>
-      <w:bookmarkEnd w:id="1"/>
-      <w:r>
-        <w:rPr>
-          <w:rFonts w:ascii="Times New Roman" w:hAnsi="Times New Roman" w:cs="Times New Roman"/>
-          <w:sz w:val="24"/>
-          <w:szCs w:val="24"/>
-          <w:highlight w:val="red"/>
+      <w:bookmarkEnd w:id="2"/>
+      <w:r>
+        <w:rPr>
+          <w:rFonts w:ascii="Times New Roman" w:hAnsi="Times New Roman" w:cs="Times New Roman"/>
+          <w:sz w:val="24"/>
+          <w:szCs w:val="24"/>
         </w:rPr>
         <w:t xml:space="preserve">{{ </w:t>
       </w:r>
@@ -1805,16 +1948,14 @@
           <w:rFonts w:ascii="Times New Roman" w:hAnsi="Times New Roman" w:cs="Times New Roman"/>
           <w:sz w:val="24"/>
           <w:szCs w:val="24"/>
-          <w:highlight w:val="red"/>
-        </w:rPr>
-        <w:t>WC_CPI_year_high</w:t>
-      </w:r>
-      <w:r>
-        <w:rPr>
-          <w:rFonts w:ascii="Times New Roman" w:hAnsi="Times New Roman" w:cs="Times New Roman"/>
-          <w:sz w:val="24"/>
-          <w:szCs w:val="24"/>
-          <w:highlight w:val="red"/>
+        </w:rPr>
+        <w:t>WC_CPI_duration_max</w:t>
+      </w:r>
+      <w:r>
+        <w:rPr>
+          <w:rFonts w:ascii="Times New Roman" w:hAnsi="Times New Roman" w:cs="Times New Roman"/>
+          <w:sz w:val="24"/>
+          <w:szCs w:val="24"/>
         </w:rPr>
         <w:t xml:space="preserve"> }}</w:t>
       </w:r>
@@ -1834,13 +1975,12 @@
         </w:rPr>
         <w:t xml:space="preserve"> </w:t>
       </w:r>
-      <w:commentRangeStart w:id="2"/>
-      <w:r>
-        <w:rPr>
-          <w:rFonts w:ascii="Times New Roman" w:hAnsi="Times New Roman" w:cs="Times New Roman"/>
-          <w:sz w:val="24"/>
-          <w:szCs w:val="24"/>
-          <w:highlight w:val="red"/>
+      <w:r>
+        <w:rPr>
+          <w:rFonts w:ascii="Times New Roman" w:hAnsi="Times New Roman" w:cs="Times New Roman"/>
+          <w:sz w:val="24"/>
+          <w:szCs w:val="24"/>
+          <w:highlight w:val="green"/>
         </w:rPr>
         <w:t xml:space="preserve">equivalent to the duration of </w:t>
       </w:r>
@@ -1849,27 +1989,9 @@
           <w:rFonts w:ascii="Times New Roman" w:hAnsi="Times New Roman" w:cs="Times New Roman"/>
           <w:sz w:val="24"/>
           <w:szCs w:val="24"/>
-          <w:highlight w:val="red"/>
-        </w:rPr>
-        <w:t>future medical care</w:t>
-      </w:r>
-      <w:commentRangeEnd w:id="2"/>
-      <w:r>
-        <w:rPr>
-          <w:rStyle w:val="CommentReference"/>
-          <w:rFonts w:ascii="Times New Roman" w:hAnsi="Times New Roman" w:cs="Times New Roman"/>
-          <w:sz w:val="24"/>
-          <w:szCs w:val="24"/>
-        </w:rPr>
-        <w:commentReference w:id="2"/>
-      </w:r>
-      <w:r>
-        <w:rPr>
-          <w:rFonts w:ascii="Times New Roman" w:hAnsi="Times New Roman" w:cs="Times New Roman"/>
-          <w:sz w:val="24"/>
-          <w:szCs w:val="24"/>
-        </w:rPr>
-        <w:t>.</w:t>
+          <w:highlight w:val="green"/>
+        </w:rPr>
+        <w:t>future medical care.</w:t>
       </w:r>
     </w:p>
     <w:tbl>
@@ -1880,7 +2002,7 @@
       </w:tblPr>
       <w:tblGrid>
         <w:gridCol w:w="4892"/>
-        <w:gridCol w:w="1907"/>
+        <w:gridCol w:w="2296"/>
       </w:tblGrid>
       <w:tr>
         <w:trPr>
@@ -2010,6 +2132,15 @@
               </w:rPr>
               <w:t xml:space="preserve"> Services</w:t>
             </w:r>
+            <w:r>
+              <w:rPr>
+                <w:rFonts w:ascii="Times New Roman" w:hAnsi="Times New Roman" w:cs="Times New Roman"/>
+                <w:color w:val="000000"/>
+                <w:sz w:val="24"/>
+                <w:szCs w:val="24"/>
+              </w:rPr>
+              <w:t xml:space="preserve"> (</w:t>
+            </w:r>
           </w:p>
         </w:tc>
         <w:tc>
@@ -2042,8 +2173,37 @@
                 <w:sz w:val="24"/>
                 <w:szCs w:val="24"/>
               </w:rPr>
-              <w:t>2.</w:t>
+              <w:t>{{ sel_ite_growth_rate }}</w:t>
             </w:r>
+          </w:p>
+        </w:tc>
+      </w:tr>
+      <w:tr>
+        <w:trPr>
+          <w:trHeight w:val="324"/>
+          <w:jc w:val="center"/>
+        </w:trPr>
+        <w:tc>
+          <w:tcPr>
+            <w:tcW w:w="4892" w:type="dxa"/>
+            <w:tcBorders>
+              <w:top w:val="nil"/>
+              <w:left w:val="nil"/>
+              <w:bottom w:val="nil"/>
+              <w:right w:val="nil"/>
+            </w:tcBorders>
+            <w:noWrap/>
+            <w:vAlign w:val="bottom"/>
+          </w:tcPr>
+          <w:p>
+            <w:pPr>
+              <w:rPr>
+                <w:rFonts w:ascii="Times New Roman" w:hAnsi="Times New Roman" w:cs="Times New Roman"/>
+                <w:color w:val="000000"/>
+                <w:sz w:val="24"/>
+                <w:szCs w:val="24"/>
+              </w:rPr>
+            </w:pPr>
             <w:r>
               <w:rPr>
                 <w:rFonts w:ascii="Times New Roman" w:hAnsi="Times New Roman" w:cs="Times New Roman"/>
@@ -2051,17 +2211,32 @@
                 <w:sz w:val="24"/>
                 <w:szCs w:val="24"/>
               </w:rPr>
-              <w:t>4</w:t>
+              <w:t>Physicians’ Services (5 Years)</w:t>
             </w:r>
-            <w:r>
+          </w:p>
+        </w:tc>
+        <w:tc>
+          <w:tcPr>
+            <w:tcW w:w="1907" w:type="dxa"/>
+            <w:tcBorders>
+              <w:top w:val="nil"/>
+              <w:left w:val="nil"/>
+              <w:bottom w:val="nil"/>
+              <w:right w:val="nil"/>
+            </w:tcBorders>
+            <w:noWrap/>
+            <w:vAlign w:val="bottom"/>
+          </w:tcPr>
+          <w:p>
+            <w:pPr>
+              <w:jc w:val="center"/>
               <w:rPr>
                 <w:rFonts w:ascii="Times New Roman" w:hAnsi="Times New Roman" w:cs="Times New Roman"/>
                 <w:color w:val="000000"/>
                 <w:sz w:val="24"/>
                 <w:szCs w:val="24"/>
               </w:rPr>
-              <w:t>%</w:t>
-            </w:r>
+            </w:pPr>
           </w:p>
         </w:tc>
       </w:tr>
@@ -2284,6 +2459,8 @@
               </w:rPr>
             </w:pPr>
             <w:commentRangeStart w:id="3"/>
+            <w:commentRangeStart w:id="4"/>
+            <w:commentRangeStart w:id="5"/>
             <w:r>
               <w:rPr>
                 <w:rFonts w:ascii="Times New Roman" w:hAnsi="Times New Roman" w:cs="Times New Roman"/>
@@ -2329,6 +2506,18 @@
               </w:rPr>
               <w:t>3%</w:t>
             </w:r>
+            <w:commentRangeEnd w:id="5"/>
+            <w:r>
+              <w:rPr>
+                <w:rStyle w:val="CommentReference"/>
+                <w:rFonts w:ascii="Times New Roman" w:hAnsi="Times New Roman" w:cs="Times New Roman"/>
+                <w:color w:val="000000"/>
+                <w:sz w:val="24"/>
+                <w:szCs w:val="24"/>
+                <w:highlight w:val="red"/>
+              </w:rPr>
+              <w:commentReference w:id="5"/>
+            </w:r>
             <w:commentRangeEnd w:id="3"/>
             <w:r>
               <w:rPr>
@@ -2341,6 +2530,18 @@
               </w:rPr>
               <w:commentReference w:id="3"/>
             </w:r>
+            <w:commentRangeEnd w:id="4"/>
+            <w:r>
+              <w:rPr>
+                <w:rStyle w:val="CommentReference"/>
+                <w:rFonts w:ascii="Times New Roman" w:hAnsi="Times New Roman" w:cs="Times New Roman"/>
+                <w:color w:val="000000"/>
+                <w:sz w:val="24"/>
+                <w:szCs w:val="24"/>
+                <w:highlight w:val="red"/>
+              </w:rPr>
+              <w:commentReference w:id="4"/>
+            </w:r>
           </w:p>
         </w:tc>
       </w:tr>
@@ -2413,7 +2614,7 @@
         </w:rPr>
         <w:t xml:space="preserve">follow from the tables on pages </w:t>
       </w:r>
-      <w:commentRangeStart w:id="4"/>
+      <w:commentRangeStart w:id="6"/>
       <w:r>
         <w:rPr>
           <w:rFonts w:ascii="Times New Roman" w:hAnsi="Times New Roman" w:cs="Times New Roman"/>
@@ -2423,7 +2624,7 @@
         </w:rPr>
         <w:t>5-10</w:t>
       </w:r>
-      <w:commentRangeEnd w:id="4"/>
+      <w:commentRangeEnd w:id="6"/>
       <w:r>
         <w:rPr>
           <w:rStyle w:val="CommentReference"/>
@@ -2431,7 +2632,7 @@
           <w:sz w:val="24"/>
           <w:szCs w:val="24"/>
         </w:rPr>
-        <w:commentReference w:id="4"/>
+        <w:commentReference w:id="6"/>
       </w:r>
       <w:r>
         <w:rPr>
@@ -2503,7 +2704,23 @@
           <w:sz w:val="24"/>
           <w:szCs w:val="24"/>
         </w:rPr>
-        <w:t xml:space="preserve">lan. </w:t>
+        <w:t>lan</w:t>
+      </w:r>
+      <w:r>
+        <w:rPr>
+          <w:rFonts w:ascii="Times New Roman" w:hAnsi="Times New Roman" w:cs="Times New Roman"/>
+          <w:sz w:val="24"/>
+          <w:szCs w:val="24"/>
+        </w:rPr>
+        <w:t xml:space="preserve"> (or MCP)</w:t>
+      </w:r>
+      <w:r>
+        <w:rPr>
+          <w:rFonts w:ascii="Times New Roman" w:hAnsi="Times New Roman" w:cs="Times New Roman"/>
+          <w:sz w:val="24"/>
+          <w:szCs w:val="24"/>
+        </w:rPr>
+        <w:t xml:space="preserve">. </w:t>
       </w:r>
     </w:p>
     <w:p>
@@ -2676,7 +2893,7 @@
           <w:szCs w:val="24"/>
         </w:rPr>
       </w:pPr>
-      <w:bookmarkStart w:id="5" w:name="OLE_LINK1"/>
+      <w:bookmarkStart w:id="7" w:name="OLE_LINK1"/>
       <w:r>
         <w:rPr>
           <w:rFonts w:ascii="Times New Roman" w:eastAsia="Times New Roman" w:hAnsi="Times New Roman" w:cs="Times New Roman"/>
@@ -2745,6 +2962,7 @@
           <w:sz w:val="24"/>
           <w:szCs w:val="24"/>
         </w:rPr>
+        <w:lastRenderedPageBreak/>
         <w:drawing>
           <wp:inline distT="0" distB="0" distL="0" distR="0" wp14:anchorId="2567DAFE" wp14:editId="1C490470">
             <wp:extent cx="1790700" cy="332339"/>
@@ -2803,7 +3021,7 @@
         </w:rPr>
         <w:t>Shael N. Wolfson, PhD</w:t>
       </w:r>
-      <w:bookmarkEnd w:id="5"/>
+      <w:bookmarkEnd w:id="7"/>
     </w:p>
     <w:p>
       <w:pPr>
@@ -2852,7 +3070,6 @@
           <w:iCs/>
           <w:u w:val="single"/>
         </w:rPr>
-        <w:lastRenderedPageBreak/>
         <w:br w:type="page"/>
       </w:r>
     </w:p>
@@ -2886,7 +3103,7 @@
           <w:szCs w:val="24"/>
         </w:rPr>
       </w:pPr>
-      <w:commentRangeStart w:id="6"/>
+      <w:commentRangeStart w:id="8"/>
       <w:r>
         <w:rPr>
           <w:rFonts w:ascii="Times New Roman" w:eastAsia="Times New Roman" w:hAnsi="Times New Roman" w:cs="Times New Roman"/>
@@ -2911,7 +3128,7 @@
         </w:rPr>
         <w:t>Future Medical Care</w:t>
       </w:r>
-      <w:commentRangeEnd w:id="6"/>
+      <w:commentRangeEnd w:id="8"/>
       <w:r>
         <w:rPr>
           <w:rStyle w:val="CommentReference"/>
@@ -2919,7 +3136,7 @@
           <w:sz w:val="24"/>
           <w:szCs w:val="24"/>
         </w:rPr>
-        <w:commentReference w:id="6"/>
+        <w:commentReference w:id="8"/>
       </w:r>
       <w:r>
         <w:rPr>
@@ -2995,6 +3212,7 @@
           <w:rFonts w:ascii="Times New Roman" w:eastAsia="Times New Roman" w:hAnsi="Times New Roman" w:cs="Times New Roman"/>
           <w:sz w:val="24"/>
           <w:szCs w:val="24"/>
+          <w:highlight w:val="red"/>
         </w:rPr>
         <w:t xml:space="preserve">{{ </w:t>
       </w:r>
@@ -3003,78 +3221,89 @@
           <w:rFonts w:ascii="Times New Roman" w:eastAsia="Times New Roman" w:hAnsi="Times New Roman" w:cs="Times New Roman"/>
           <w:sz w:val="24"/>
           <w:szCs w:val="24"/>
-        </w:rPr>
-        <w:t>WC_PV_summary_table</w:t>
+          <w:highlight w:val="red"/>
+        </w:rPr>
+        <w:t>WC_PV_</w:t>
       </w:r>
       <w:r>
         <w:rPr>
           <w:rFonts w:ascii="Times New Roman" w:eastAsia="Times New Roman" w:hAnsi="Times New Roman" w:cs="Times New Roman"/>
           <w:sz w:val="24"/>
           <w:szCs w:val="24"/>
+          <w:highlight w:val="red"/>
+        </w:rPr>
+        <w:t>FORMATTED_</w:t>
+      </w:r>
+      <w:r>
+        <w:rPr>
+          <w:rFonts w:ascii="Times New Roman" w:eastAsia="Times New Roman" w:hAnsi="Times New Roman" w:cs="Times New Roman"/>
+          <w:sz w:val="24"/>
+          <w:szCs w:val="24"/>
+          <w:highlight w:val="red"/>
+        </w:rPr>
+        <w:t>summary_table</w:t>
+      </w:r>
+      <w:r>
+        <w:rPr>
+          <w:rFonts w:ascii="Times New Roman" w:eastAsia="Times New Roman" w:hAnsi="Times New Roman" w:cs="Times New Roman"/>
+          <w:sz w:val="24"/>
+          <w:szCs w:val="24"/>
+          <w:highlight w:val="red"/>
         </w:rPr>
         <w:t xml:space="preserve"> }}</w:t>
       </w:r>
     </w:p>
     <w:p>
       <w:pPr>
-        <w:spacing w:before="100" w:beforeAutospacing="1" w:after="100" w:afterAutospacing="1" w:line="240" w:lineRule="auto"/>
-        <w:ind w:left="720"/>
-        <w:rPr>
-          <w:rFonts w:ascii="Times New Roman" w:hAnsi="Times New Roman" w:cs="Times New Roman"/>
-          <w:sz w:val="24"/>
-          <w:szCs w:val="24"/>
-        </w:rPr>
-      </w:pPr>
-    </w:p>
-    <w:p>
-      <w:pPr>
-        <w:spacing w:before="100" w:beforeAutospacing="1" w:after="100" w:afterAutospacing="1" w:line="240" w:lineRule="auto"/>
-        <w:ind w:left="720"/>
-        <w:rPr>
-          <w:rFonts w:ascii="Times New Roman" w:hAnsi="Times New Roman" w:cs="Times New Roman"/>
-          <w:sz w:val="24"/>
-          <w:szCs w:val="24"/>
-        </w:rPr>
-      </w:pPr>
-    </w:p>
-    <w:p>
-      <w:pPr>
-        <w:spacing w:before="100" w:beforeAutospacing="1" w:after="100" w:afterAutospacing="1" w:line="240" w:lineRule="auto"/>
-        <w:ind w:left="720"/>
-        <w:rPr>
-          <w:rFonts w:ascii="Times New Roman" w:hAnsi="Times New Roman" w:cs="Times New Roman"/>
-          <w:sz w:val="24"/>
-          <w:szCs w:val="24"/>
-        </w:rPr>
-      </w:pPr>
-    </w:p>
-    <w:p>
-      <w:pPr>
-        <w:spacing w:before="100" w:beforeAutospacing="1" w:after="100" w:afterAutospacing="1" w:line="240" w:lineRule="auto"/>
-        <w:ind w:left="720"/>
-        <w:rPr>
-          <w:rFonts w:ascii="Times New Roman" w:hAnsi="Times New Roman" w:cs="Times New Roman"/>
-          <w:sz w:val="24"/>
-          <w:szCs w:val="24"/>
-        </w:rPr>
-      </w:pPr>
-    </w:p>
-    <w:p>
-      <w:pPr>
-        <w:keepNext/>
-        <w:tabs>
-          <w:tab w:val="left" w:pos="-720"/>
-        </w:tabs>
-        <w:suppressAutoHyphens/>
-        <w:spacing w:after="0"/>
+        <w:rPr>
+          <w:rFonts w:ascii="Times New Roman" w:hAnsi="Times New Roman" w:cs="Times New Roman"/>
+          <w:sz w:val="24"/>
+          <w:szCs w:val="24"/>
+        </w:rPr>
+      </w:pPr>
+    </w:p>
+    <w:p>
+      <w:pPr>
+        <w:rPr>
+          <w:rFonts w:ascii="Times New Roman" w:hAnsi="Times New Roman" w:cs="Times New Roman"/>
+          <w:sz w:val="24"/>
+          <w:szCs w:val="24"/>
+        </w:rPr>
+      </w:pPr>
+    </w:p>
+    <w:p>
+      <w:pPr>
         <w:jc w:val="center"/>
-        <w:outlineLvl w:val="3"/>
-        <w:rPr>
-          <w:rFonts w:ascii="Times New Roman" w:hAnsi="Times New Roman" w:cs="Times New Roman"/>
-          <w:sz w:val="24"/>
-          <w:szCs w:val="24"/>
-        </w:rPr>
-      </w:pPr>
+        <w:rPr>
+          <w:rFonts w:ascii="Times New Roman" w:hAnsi="Times New Roman" w:cs="Times New Roman"/>
+          <w:sz w:val="24"/>
+          <w:szCs w:val="24"/>
+        </w:rPr>
+      </w:pPr>
+      <w:r>
+        <w:rPr>
+          <w:rFonts w:ascii="Times New Roman" w:hAnsi="Times New Roman" w:cs="Times New Roman"/>
+          <w:sz w:val="24"/>
+          <w:szCs w:val="24"/>
+        </w:rPr>
+        <w:t xml:space="preserve">{{ </w:t>
+      </w:r>
+      <w:r>
+        <w:rPr>
+          <w:rFonts w:ascii="Times New Roman" w:hAnsi="Times New Roman" w:cs="Times New Roman"/>
+          <w:sz w:val="24"/>
+          <w:szCs w:val="24"/>
+        </w:rPr>
+        <w:t>WC_Disc_Rate_Chart</w:t>
+      </w:r>
+      <w:r>
+        <w:rPr>
+          <w:rFonts w:ascii="Times New Roman" w:hAnsi="Times New Roman" w:cs="Times New Roman"/>
+          <w:sz w:val="24"/>
+          <w:szCs w:val="24"/>
+        </w:rPr>
+        <w:t xml:space="preserve"> }}</w:t>
+      </w:r>
     </w:p>
     <w:p>
       <w:pPr>
@@ -3364,7 +3593,6 @@
         </w:rPr>
         <w:t>Municipal Securities Rulemaking Board. (</w:t>
       </w:r>
-      <w:commentRangeStart w:id="7"/>
       <w:r>
         <w:rPr>
           <w:rFonts w:ascii="Times New Roman" w:hAnsi="Times New Roman" w:cs="Times New Roman"/>
@@ -3372,54 +3600,7 @@
           <w:szCs w:val="24"/>
           <w:highlight w:val="red"/>
         </w:rPr>
-        <w:t>February</w:t>
-      </w:r>
-      <w:r>
-        <w:rPr>
-          <w:rFonts w:ascii="Times New Roman" w:hAnsi="Times New Roman" w:cs="Times New Roman"/>
-          <w:sz w:val="24"/>
-          <w:szCs w:val="24"/>
-          <w:highlight w:val="red"/>
-        </w:rPr>
-        <w:t xml:space="preserve"> </w:t>
-      </w:r>
-      <w:commentRangeEnd w:id="7"/>
-      <w:r>
-        <w:rPr>
-          <w:rStyle w:val="CommentReference"/>
-          <w:rFonts w:ascii="Times New Roman" w:hAnsi="Times New Roman" w:cs="Times New Roman"/>
-          <w:sz w:val="24"/>
-          <w:szCs w:val="24"/>
-          <w:highlight w:val="red"/>
-        </w:rPr>
-        <w:commentReference w:id="7"/>
-      </w:r>
-      <w:r>
-        <w:rPr>
-          <w:rFonts w:ascii="Times New Roman" w:hAnsi="Times New Roman" w:cs="Times New Roman"/>
-          <w:sz w:val="24"/>
-          <w:szCs w:val="24"/>
-          <w:highlight w:val="red"/>
-        </w:rPr>
-        <w:t>2</w:t>
-      </w:r>
-      <w:r>
-        <w:rPr>
-          <w:rFonts w:ascii="Times New Roman" w:hAnsi="Times New Roman" w:cs="Times New Roman"/>
-          <w:sz w:val="24"/>
-          <w:szCs w:val="24"/>
-          <w:highlight w:val="red"/>
-        </w:rPr>
-        <w:t>, 202</w:t>
-      </w:r>
-      <w:r>
-        <w:rPr>
-          <w:rFonts w:ascii="Times New Roman" w:hAnsi="Times New Roman" w:cs="Times New Roman"/>
-          <w:sz w:val="24"/>
-          <w:szCs w:val="24"/>
-          <w:highlight w:val="red"/>
-        </w:rPr>
-        <w:t>6</w:t>
+        <w:t>{{ WC_disc_rate_date }}</w:t>
       </w:r>
       <w:r>
         <w:rPr>
@@ -3481,7 +3662,6 @@
           <w:szCs w:val="24"/>
         </w:rPr>
       </w:pPr>
-      <w:commentRangeStart w:id="8"/>
       <w:r>
         <w:rPr>
           <w:rFonts w:ascii="Times New Roman" w:hAnsi="Times New Roman" w:cs="Times New Roman"/>
@@ -4105,16 +4285,6 @@
           <w:szCs w:val="24"/>
         </w:rPr>
         <w:t>. Retrieved from https://download.bls.gov/pub/time.series/cu/cu.data.15.USMedical</w:t>
-      </w:r>
-      <w:commentRangeEnd w:id="8"/>
-      <w:r>
-        <w:rPr>
-          <w:rStyle w:val="CommentReference"/>
-          <w:rFonts w:ascii="Times New Roman" w:hAnsi="Times New Roman" w:cs="Times New Roman"/>
-          <w:sz w:val="24"/>
-          <w:szCs w:val="24"/>
-        </w:rPr>
-        <w:commentReference w:id="8"/>
       </w:r>
     </w:p>
     <w:sectPr>
@@ -4134,7 +4304,33 @@
 
 <file path=word/comments.xml><?xml version="1.0" encoding="utf-8"?>
 <w:comments xmlns:wpc="http://schemas.microsoft.com/office/word/2010/wordprocessingCanvas" xmlns:cx="http://schemas.microsoft.com/office/drawing/2014/chartex" xmlns:cx1="http://schemas.microsoft.com/office/drawing/2015/9/8/chartex" xmlns:cx2="http://schemas.microsoft.com/office/drawing/2015/10/21/chartex" xmlns:cx3="http://schemas.microsoft.com/office/drawing/2016/5/9/chartex" xmlns:cx4="http://schemas.microsoft.com/office/drawing/2016/5/10/chartex" xmlns:cx5="http://schemas.microsoft.com/office/drawing/2016/5/11/chartex" xmlns:cx6="http://schemas.microsoft.com/office/drawing/2016/5/12/chartex" xmlns:cx7="http://schemas.microsoft.com/office/drawing/2016/5/13/chartex" xmlns:cx8="http://schemas.microsoft.com/office/drawing/2016/5/14/chartex" xmlns:mc="http://schemas.openxmlformats.org/markup-compatibility/2006" xmlns:aink="http://schemas.microsoft.com/office/drawing/2016/ink" xmlns:am3d="http://schemas.microsoft.com/office/drawing/2017/model3d" xmlns:o="urn:schemas-microsoft-com:office:office" xmlns:oel="http://schemas.microsoft.com/office/2019/extlst" xmlns:r="http://schemas.openxmlformats.org/officeDocument/2006/relationships" xmlns:m="http://schemas.openxmlformats.org/officeDocument/2006/math" xmlns:v="urn:schemas-microsoft-com:vml" xmlns:wp14="http://schemas.microsoft.com/office/word/2010/wordprocessingDrawing" xmlns:wp="http://schemas.openxmlformats.org/drawingml/2006/wordprocessingDrawing" xmlns:w10="urn:schemas-microsoft-com:office:word" xmlns:w="http://schemas.openxmlformats.org/wordprocessingml/2006/main" xmlns:w14="http://schemas.microsoft.com/office/word/2010/wordml" xmlns:w15="http://schemas.microsoft.com/office/word/2012/wordml" xmlns:w16cex="http://schemas.microsoft.com/office/word/2018/wordml/cex" xmlns:w16cid="http://schemas.microsoft.com/office/word/2016/wordml/cid" xmlns:w16="http://schemas.microsoft.com/office/word/2018/wordml" xmlns:w16du="http://schemas.microsoft.com/office/word/2023/wordml/word16du" xmlns:w16sdtdh="http://schemas.microsoft.com/office/word/2020/wordml/sdtdatahash" xmlns:w16sdtfl="http://schemas.microsoft.com/office/word/2024/wordml/sdtformatlock" xmlns:w16se="http://schemas.microsoft.com/office/word/2015/wordml/symex" xmlns:wpg="http://schemas.microsoft.com/office/word/2010/wordprocessingGroup" xmlns:wpi="http://schemas.microsoft.com/office/word/2010/wordprocessingInk" xmlns:wne="http://schemas.microsoft.com/office/word/2006/wordml" xmlns:wps="http://schemas.microsoft.com/office/word/2010/wordprocessingShape" mc:Ignorable="w14 w15 w16se w16cid w16 w16cex w16sdtdh w16sdtfl w16du wp14">
-  <w:comment w:id="0" w:author="Eric Bussey" w:date="2026-04-20T11:48:00Z" w:initials="EB">
+  <w:comment w:id="0" w:author="Eric Bussey" w:date="2026-05-07T11:40:00Z" w:initials="EB">
+    <w:p>
+      <w:pPr>
+        <w:pStyle w:val="CommentText"/>
+      </w:pPr>
+      <w:r>
+        <w:rPr>
+          <w:rStyle w:val="CommentReference"/>
+        </w:rPr>
+        <w:annotationRef/>
+      </w:r>
+      <w:r>
+        <w:t xml:space="preserve">Based on longest </w:t>
+      </w:r>
+      <w:r>
+        <w:rPr>
+          <w:b/>
+          <w:bCs/>
+        </w:rPr>
+        <w:t>duration</w:t>
+      </w:r>
+      <w:r>
+        <w:t xml:space="preserve"> of annual items</w:t>
+      </w:r>
+    </w:p>
+  </w:comment>
+  <w:comment w:id="1" w:author="Eric Bussey" w:date="2026-04-20T11:48:00Z" w:initials="EB">
     <w:p>
       <w:pPr>
         <w:pStyle w:val="CommentText"/>
@@ -4180,34 +4376,7 @@
       </w:r>
     </w:p>
   </w:comment>
-  <w:comment w:id="2" w:author="Eric Bussey" w:date="2026-04-30T11:51:00Z" w:initials="EB">
-    <w:p>
-      <w:pPr>
-        <w:pStyle w:val="CommentText"/>
-      </w:pPr>
-      <w:r>
-        <w:rPr>
-          <w:rStyle w:val="CommentReference"/>
-        </w:rPr>
-        <w:annotationRef/>
-      </w:r>
-      <w:r>
-        <w:t xml:space="preserve">Need </w:t>
-      </w:r>
-      <w:r>
-        <w:rPr>
-          <w:b/>
-          <w:bCs/>
-          <w:u w:val="single"/>
-        </w:rPr>
-        <w:t>boolean check variable</w:t>
-      </w:r>
-      <w:r>
-        <w:t xml:space="preserve"> for LCP duration specified vs not</w:t>
-      </w:r>
-    </w:p>
-  </w:comment>
-  <w:comment w:id="3" w:author="Eric Bussey" w:date="2026-04-20T11:48:00Z" w:initials="EB">
+  <w:comment w:id="5" w:author="Eric Bussey" w:date="2026-04-20T11:48:00Z" w:initials="EB">
     <w:p>
       <w:pPr>
         <w:pStyle w:val="CommentText"/>
@@ -4243,7 +4412,7 @@
       </w:r>
     </w:p>
   </w:comment>
-  <w:comment w:id="4" w:author="Eric Bussey" w:date="2026-04-30T11:53:00Z" w:initials="EB">
+  <w:comment w:id="3" w:author="Eric Bussey" w:date="2026-05-07T11:46:00Z" w:initials="EB">
     <w:p>
       <w:pPr>
         <w:pStyle w:val="CommentText"/>
@@ -4255,11 +4424,83 @@
         <w:annotationRef/>
       </w:r>
       <w:r>
+        <w:t>Depending on duration, can have 2 growth rates:</w:t>
+      </w:r>
+    </w:p>
+    <w:p>
+      <w:pPr>
+        <w:pStyle w:val="CommentText"/>
+        <w:ind w:left="300"/>
+      </w:pPr>
+      <w:r>
+        <w:t>Rate Short (less than 30 years)</w:t>
+      </w:r>
+    </w:p>
+    <w:p>
+      <w:pPr>
+        <w:pStyle w:val="CommentText"/>
+        <w:ind w:left="300"/>
+      </w:pPr>
+      <w:r>
+        <w:t>Rate Long (30+ years)</w:t>
+      </w:r>
+    </w:p>
+    <w:p>
+      <w:pPr>
+        <w:pStyle w:val="CommentText"/>
+      </w:pPr>
+    </w:p>
+    <w:p>
+      <w:pPr>
+        <w:pStyle w:val="CommentText"/>
+      </w:pPr>
+      <w:r>
+        <w:t>Category Names repeat for different durations, each has its own row and relevant rate (see above)</w:t>
+      </w:r>
+    </w:p>
+  </w:comment>
+  <w:comment w:id="4" w:author="Eric Bussey" w:date="2026-05-07T11:48:00Z" w:initials="EB">
+    <w:p>
+      <w:pPr>
+        <w:pStyle w:val="CommentText"/>
+      </w:pPr>
+      <w:r>
+        <w:rPr>
+          <w:rStyle w:val="CommentReference"/>
+        </w:rPr>
+        <w:annotationRef/>
+      </w:r>
+      <w:r>
+        <w:t xml:space="preserve">Need to auto-pull duration (e.g., 5 years) for category names, also update </w:t>
+      </w:r>
+      <w:r>
+        <w:rPr>
+          <w:b/>
+          <w:bCs/>
+          <w:i/>
+          <w:iCs/>
+        </w:rPr>
+        <w:t>sources!!</w:t>
+      </w:r>
+    </w:p>
+  </w:comment>
+  <w:comment w:id="6" w:author="Eric Bussey" w:date="2026-04-30T11:53:00Z" w:initials="EB">
+    <w:p>
+      <w:pPr>
+        <w:pStyle w:val="CommentText"/>
+      </w:pPr>
+      <w:r>
+        <w:rPr>
+          <w:rStyle w:val="CommentReference"/>
+        </w:rPr>
+        <w:annotationRef/>
+      </w:r>
+      <w:r>
         <w:t>Work some magic to extract pages numbers with tables</w:t>
       </w:r>
     </w:p>
   </w:comment>
-  <w:comment w:id="6" w:author="Eric Bussey" w:date="2026-04-20T11:56:00Z" w:initials="EB">
+  <w:comment w:id="8" w:author="Eric Bussey" w:date="2026-04-20T11:56:00Z" w:initials="EB">
     <w:p>
       <w:pPr>
         <w:pStyle w:val="CommentText"/>
@@ -4606,58 +4847,6 @@
           <w:u w:val="single"/>
         </w:rPr>
         <w:t>FIRST LINE/SECTION HEADERS</w:t>
-      </w:r>
-    </w:p>
-  </w:comment>
-  <w:comment w:id="7" w:author="Eric Bussey" w:date="2026-04-20T11:49:00Z" w:initials="EB">
-    <w:p>
-      <w:pPr>
-        <w:pStyle w:val="CommentText"/>
-      </w:pPr>
-      <w:r>
-        <w:rPr>
-          <w:rStyle w:val="CommentReference"/>
-        </w:rPr>
-        <w:annotationRef/>
-      </w:r>
-      <w:r>
-        <w:t>This is Bloomberg data citation</w:t>
-      </w:r>
-    </w:p>
-  </w:comment>
-  <w:comment w:id="8" w:author="Eric Bussey" w:date="2026-04-20T11:49:00Z" w:initials="EB">
-    <w:p>
-      <w:pPr>
-        <w:pStyle w:val="CommentText"/>
-      </w:pPr>
-      <w:r>
-        <w:rPr>
-          <w:rStyle w:val="CommentReference"/>
-        </w:rPr>
-        <w:annotationRef/>
-      </w:r>
-      <w:r>
-        <w:t xml:space="preserve">All pulled from </w:t>
-      </w:r>
-      <w:r>
-        <w:rPr>
-          <w:b/>
-          <w:bCs/>
-          <w:u w:val="single"/>
-        </w:rPr>
-        <w:t>Working Calc -&gt; CPI</w:t>
-      </w:r>
-      <w:r>
-        <w:t xml:space="preserve">, categories determined by </w:t>
-      </w:r>
-      <w:r>
-        <w:rPr>
-          <w:b/>
-          <w:bCs/>
-          <w:i/>
-          <w:iCs/>
-        </w:rPr>
-        <w:t>items in LCP</w:t>
       </w:r>
     </w:p>
   </w:comment>
@@ -4666,37 +4855,37 @@
 
 <file path=word/commentsExtended.xml><?xml version="1.0" encoding="utf-8"?>
 <w15:commentsEx xmlns:wpc="http://schemas.microsoft.com/office/word/2010/wordprocessingCanvas" xmlns:cx="http://schemas.microsoft.com/office/drawing/2014/chartex" xmlns:cx1="http://schemas.microsoft.com/office/drawing/2015/9/8/chartex" xmlns:cx2="http://schemas.microsoft.com/office/drawing/2015/10/21/chartex" xmlns:cx3="http://schemas.microsoft.com/office/drawing/2016/5/9/chartex" xmlns:cx4="http://schemas.microsoft.com/office/drawing/2016/5/10/chartex" xmlns:cx5="http://schemas.microsoft.com/office/drawing/2016/5/11/chartex" xmlns:cx6="http://schemas.microsoft.com/office/drawing/2016/5/12/chartex" xmlns:cx7="http://schemas.microsoft.com/office/drawing/2016/5/13/chartex" xmlns:cx8="http://schemas.microsoft.com/office/drawing/2016/5/14/chartex" xmlns:mc="http://schemas.openxmlformats.org/markup-compatibility/2006" xmlns:aink="http://schemas.microsoft.com/office/drawing/2016/ink" xmlns:am3d="http://schemas.microsoft.com/office/drawing/2017/model3d" xmlns:o="urn:schemas-microsoft-com:office:office" xmlns:oel="http://schemas.microsoft.com/office/2019/extlst" xmlns:r="http://schemas.openxmlformats.org/officeDocument/2006/relationships" xmlns:m="http://schemas.openxmlformats.org/officeDocument/2006/math" xmlns:v="urn:schemas-microsoft-com:vml" xmlns:wp14="http://schemas.microsoft.com/office/word/2010/wordprocessingDrawing" xmlns:wp="http://schemas.openxmlformats.org/drawingml/2006/wordprocessingDrawing" xmlns:w10="urn:schemas-microsoft-com:office:word" xmlns:w="http://schemas.openxmlformats.org/wordprocessingml/2006/main" xmlns:w14="http://schemas.microsoft.com/office/word/2010/wordml" xmlns:w15="http://schemas.microsoft.com/office/word/2012/wordml" xmlns:w16cex="http://schemas.microsoft.com/office/word/2018/wordml/cex" xmlns:w16cid="http://schemas.microsoft.com/office/word/2016/wordml/cid" xmlns:w16="http://schemas.microsoft.com/office/word/2018/wordml" xmlns:w16du="http://schemas.microsoft.com/office/word/2023/wordml/word16du" xmlns:w16sdtdh="http://schemas.microsoft.com/office/word/2020/wordml/sdtdatahash" xmlns:w16sdtfl="http://schemas.microsoft.com/office/word/2024/wordml/sdtformatlock" xmlns:w16se="http://schemas.microsoft.com/office/word/2015/wordml/symex" xmlns:wpg="http://schemas.microsoft.com/office/word/2010/wordprocessingGroup" xmlns:wpi="http://schemas.microsoft.com/office/word/2010/wordprocessingInk" xmlns:wne="http://schemas.microsoft.com/office/word/2006/wordml" xmlns:wps="http://schemas.microsoft.com/office/word/2010/wordprocessingShape" mc:Ignorable="w14 w15 w16se w16cid w16 w16cex w16sdtdh w16sdtfl w16du wp14">
+  <w15:commentEx w15:paraId="5A676B16" w15:done="0"/>
   <w15:commentEx w15:paraId="685DDBC2" w15:done="0"/>
-  <w15:commentEx w15:paraId="4A6FE245" w15:done="0"/>
   <w15:commentEx w15:paraId="3C9C6B18" w15:done="0"/>
+  <w15:commentEx w15:paraId="2527C0FE" w15:done="0"/>
+  <w15:commentEx w15:paraId="5539234F" w15:paraIdParent="2527C0FE" w15:done="0"/>
   <w15:commentEx w15:paraId="4077BC5E" w15:done="0"/>
   <w15:commentEx w15:paraId="2496C88D" w15:done="0"/>
-  <w15:commentEx w15:paraId="56030A41" w15:done="0"/>
-  <w15:commentEx w15:paraId="0E51D427" w15:done="0"/>
 </w15:commentsEx>
 </file>
 
 <file path=word/commentsExtensible.xml><?xml version="1.0" encoding="utf-8"?>
 <w16cex:commentsExtensible xmlns:wpc="http://schemas.microsoft.com/office/word/2010/wordprocessingCanvas" xmlns:cx="http://schemas.microsoft.com/office/drawing/2014/chartex" xmlns:cx1="http://schemas.microsoft.com/office/drawing/2015/9/8/chartex" xmlns:cx2="http://schemas.microsoft.com/office/drawing/2015/10/21/chartex" xmlns:cx3="http://schemas.microsoft.com/office/drawing/2016/5/9/chartex" xmlns:cx4="http://schemas.microsoft.com/office/drawing/2016/5/10/chartex" xmlns:cx5="http://schemas.microsoft.com/office/drawing/2016/5/11/chartex" xmlns:cx6="http://schemas.microsoft.com/office/drawing/2016/5/12/chartex" xmlns:cx7="http://schemas.microsoft.com/office/drawing/2016/5/13/chartex" xmlns:cx8="http://schemas.microsoft.com/office/drawing/2016/5/14/chartex" xmlns:cr="http://schemas.microsoft.com/office/comments/2020/reactions" xmlns:mc="http://schemas.openxmlformats.org/markup-compatibility/2006" xmlns:aink="http://schemas.microsoft.com/office/drawing/2016/ink" xmlns:am3d="http://schemas.microsoft.com/office/drawing/2017/model3d" xmlns:o="urn:schemas-microsoft-com:office:office" xmlns:oel="http://schemas.microsoft.com/office/2019/extlst" xmlns:r="http://schemas.openxmlformats.org/officeDocument/2006/relationships" xmlns:m="http://schemas.openxmlformats.org/officeDocument/2006/math" xmlns:v="urn:schemas-microsoft-com:vml" xmlns:wp14="http://schemas.microsoft.com/office/word/2010/wordprocessingDrawing" xmlns:wp="http://schemas.openxmlformats.org/drawingml/2006/wordprocessingDrawing" xmlns:w10="urn:schemas-microsoft-com:office:word" xmlns:w="http://schemas.openxmlformats.org/wordprocessingml/2006/main" xmlns:w14="http://schemas.microsoft.com/office/word/2010/wordml" xmlns:w15="http://schemas.microsoft.com/office/word/2012/wordml" xmlns:w16cex="http://schemas.microsoft.com/office/word/2018/wordml/cex" xmlns:w16cid="http://schemas.microsoft.com/office/word/2016/wordml/cid" xmlns:w16="http://schemas.microsoft.com/office/word/2018/wordml" xmlns:w16du="http://schemas.microsoft.com/office/word/2023/wordml/word16du" xmlns:w16sdtdh="http://schemas.microsoft.com/office/word/2020/wordml/sdtdatahash" xmlns:w16sdtfl="http://schemas.microsoft.com/office/word/2024/wordml/sdtformatlock" xmlns:w16se="http://schemas.microsoft.com/office/word/2015/wordml/symex" xmlns:wpg="http://schemas.microsoft.com/office/word/2010/wordprocessingGroup" xmlns:wpi="http://schemas.microsoft.com/office/word/2010/wordprocessingInk" xmlns:wne="http://schemas.microsoft.com/office/word/2006/wordml" xmlns:wps="http://schemas.microsoft.com/office/word/2010/wordprocessingShape" mc:Ignorable="w14 w15 w16se w16cid w16 w16cex w16sdtdh w16sdtfl cr w16du wp14">
+  <w16cex:commentExtensible w16cex:durableId="4B886FC1" w16cex:dateUtc="2026-05-07T16:40:00Z"/>
   <w16cex:commentExtensible w16cex:durableId="4D6F360A" w16cex:dateUtc="2026-04-20T16:48:00Z"/>
-  <w16cex:commentExtensible w16cex:durableId="6DEDF563" w16cex:dateUtc="2026-04-30T16:51:00Z"/>
   <w16cex:commentExtensible w16cex:durableId="0B670C8D" w16cex:dateUtc="2026-04-20T16:48:00Z"/>
+  <w16cex:commentExtensible w16cex:durableId="37BC61D6" w16cex:dateUtc="2026-05-07T16:46:00Z"/>
+  <w16cex:commentExtensible w16cex:durableId="052D17F6" w16cex:dateUtc="2026-05-07T16:48:00Z"/>
   <w16cex:commentExtensible w16cex:durableId="7782F7BB" w16cex:dateUtc="2026-04-30T16:53:00Z"/>
   <w16cex:commentExtensible w16cex:durableId="79C44B0A" w16cex:dateUtc="2026-04-20T16:56:00Z"/>
-  <w16cex:commentExtensible w16cex:durableId="081EC7C4" w16cex:dateUtc="2026-04-20T16:49:00Z"/>
-  <w16cex:commentExtensible w16cex:durableId="68B62712" w16cex:dateUtc="2026-04-20T16:49:00Z"/>
 </w16cex:commentsExtensible>
 </file>
 
 <file path=word/commentsIds.xml><?xml version="1.0" encoding="utf-8"?>
 <w16cid:commentsIds xmlns:wpc="http://schemas.microsoft.com/office/word/2010/wordprocessingCanvas" xmlns:cx="http://schemas.microsoft.com/office/drawing/2014/chartex" xmlns:cx1="http://schemas.microsoft.com/office/drawing/2015/9/8/chartex" xmlns:cx2="http://schemas.microsoft.com/office/drawing/2015/10/21/chartex" xmlns:cx3="http://schemas.microsoft.com/office/drawing/2016/5/9/chartex" xmlns:cx4="http://schemas.microsoft.com/office/drawing/2016/5/10/chartex" xmlns:cx5="http://schemas.microsoft.com/office/drawing/2016/5/11/chartex" xmlns:cx6="http://schemas.microsoft.com/office/drawing/2016/5/12/chartex" xmlns:cx7="http://schemas.microsoft.com/office/drawing/2016/5/13/chartex" xmlns:cx8="http://schemas.microsoft.com/office/drawing/2016/5/14/chartex" xmlns:mc="http://schemas.openxmlformats.org/markup-compatibility/2006" xmlns:aink="http://schemas.microsoft.com/office/drawing/2016/ink" xmlns:am3d="http://schemas.microsoft.com/office/drawing/2017/model3d" xmlns:o="urn:schemas-microsoft-com:office:office" xmlns:oel="http://schemas.microsoft.com/office/2019/extlst" xmlns:r="http://schemas.openxmlformats.org/officeDocument/2006/relationships" xmlns:m="http://schemas.openxmlformats.org/officeDocument/2006/math" xmlns:v="urn:schemas-microsoft-com:vml" xmlns:wp14="http://schemas.microsoft.com/office/word/2010/wordprocessingDrawing" xmlns:wp="http://schemas.openxmlformats.org/drawingml/2006/wordprocessingDrawing" xmlns:w10="urn:schemas-microsoft-com:office:word" xmlns:w="http://schemas.openxmlformats.org/wordprocessingml/2006/main" xmlns:w14="http://schemas.microsoft.com/office/word/2010/wordml" xmlns:w15="http://schemas.microsoft.com/office/word/2012/wordml" xmlns:w16cex="http://schemas.microsoft.com/office/word/2018/wordml/cex" xmlns:w16cid="http://schemas.microsoft.com/office/word/2016/wordml/cid" xmlns:w16="http://schemas.microsoft.com/office/word/2018/wordml" xmlns:w16du="http://schemas.microsoft.com/office/word/2023/wordml/word16du" xmlns:w16sdtdh="http://schemas.microsoft.com/office/word/2020/wordml/sdtdatahash" xmlns:w16sdtfl="http://schemas.microsoft.com/office/word/2024/wordml/sdtformatlock" xmlns:w16se="http://schemas.microsoft.com/office/word/2015/wordml/symex" xmlns:wpg="http://schemas.microsoft.com/office/word/2010/wordprocessingGroup" xmlns:wpi="http://schemas.microsoft.com/office/word/2010/wordprocessingInk" xmlns:wne="http://schemas.microsoft.com/office/word/2006/wordml" xmlns:wps="http://schemas.microsoft.com/office/word/2010/wordprocessingShape" mc:Ignorable="w14 w15 w16se w16cid w16 w16cex w16sdtdh w16sdtfl w16du wp14">
+  <w16cid:commentId w16cid:paraId="5A676B16" w16cid:durableId="4B886FC1"/>
   <w16cid:commentId w16cid:paraId="685DDBC2" w16cid:durableId="4D6F360A"/>
-  <w16cid:commentId w16cid:paraId="4A6FE245" w16cid:durableId="6DEDF563"/>
   <w16cid:commentId w16cid:paraId="3C9C6B18" w16cid:durableId="0B670C8D"/>
+  <w16cid:commentId w16cid:paraId="2527C0FE" w16cid:durableId="37BC61D6"/>
+  <w16cid:commentId w16cid:paraId="5539234F" w16cid:durableId="052D17F6"/>
   <w16cid:commentId w16cid:paraId="4077BC5E" w16cid:durableId="7782F7BB"/>
   <w16cid:commentId w16cid:paraId="2496C88D" w16cid:durableId="79C44B0A"/>
-  <w16cid:commentId w16cid:paraId="56030A41" w16cid:durableId="081EC7C4"/>
-  <w16cid:commentId w16cid:paraId="0E51D427" w16cid:durableId="68B62712"/>
 </w16cid:commentsIds>
 </file>
 
@@ -8107,10 +8296,6 @@
 </file>
 
 <file path=customXml/item1.xml><?xml version="1.0" encoding="utf-8"?>
-<b:Sources xmlns:b="http://schemas.openxmlformats.org/officeDocument/2006/bibliography" xmlns="http://schemas.openxmlformats.org/officeDocument/2006/bibliography" SelectedStyle="\APASixthEditionOfficeOnline.xsl" StyleName="APA" Version="6"/>
-</file>
-
-<file path=customXml/item2.xml><?xml version="1.0" encoding="utf-8"?>
 <ct:contentTypeSchema xmlns:ct="http://schemas.microsoft.com/office/2006/metadata/contentType" xmlns:ma="http://schemas.microsoft.com/office/2006/metadata/properties/metaAttributes" ct:_="" ma:_="" ma:contentTypeName="Document" ma:contentTypeID="0x010100085B5888F14DAE46912A6E0F6FCFCB07" ma:contentTypeVersion="9" ma:contentTypeDescription="Create a new document." ma:contentTypeScope="" ma:versionID="2185b18d6fd5c46c37ca5df071e41de6">
   <xsd:schema xmlns:xsd="http://www.w3.org/2001/XMLSchema" xmlns:xs="http://www.w3.org/2001/XMLSchema" xmlns:p="http://schemas.microsoft.com/office/2006/metadata/properties" xmlns:ns3="91172594-76f2-42b4-b6c8-5686d13fb17f" targetNamespace="http://schemas.microsoft.com/office/2006/metadata/properties" ma:root="true" ma:fieldsID="3ce95284eb097024ce56720a48b923a2" ns3:_="">
     <xsd:import namespace="91172594-76f2-42b4-b6c8-5686d13fb17f"/>
@@ -8286,7 +8471,19 @@
 </ct:contentTypeSchema>
 </file>
 
+<file path=customXml/item2.xml><?xml version="1.0" encoding="utf-8"?>
+<b:Sources xmlns:b="http://schemas.openxmlformats.org/officeDocument/2006/bibliography" xmlns="http://schemas.openxmlformats.org/officeDocument/2006/bibliography" SelectedStyle="\APASixthEditionOfficeOnline.xsl" StyleName="APA" Version="6"/>
+</file>
+
 <file path=customXml/item3.xml><?xml version="1.0" encoding="utf-8"?>
+<p:properties xmlns:p="http://schemas.microsoft.com/office/2006/metadata/properties" xmlns:xsi="http://www.w3.org/2001/XMLSchema-instance" xmlns:pc="http://schemas.microsoft.com/office/infopath/2007/PartnerControls">
+  <documentManagement>
+    <_activity xmlns="91172594-76f2-42b4-b6c8-5686d13fb17f" xsi:nil="true"/>
+  </documentManagement>
+</p:properties>
+</file>
+
+<file path=customXml/item4.xml><?xml version="1.0" encoding="utf-8"?>
 <?mso-contentType ?>
 <FormTemplates xmlns="http://schemas.microsoft.com/sharepoint/v3/contenttype/forms">
   <Display>DocumentLibraryForm</Display>
@@ -8295,23 +8492,7 @@
 </FormTemplates>
 </file>
 
-<file path=customXml/item4.xml><?xml version="1.0" encoding="utf-8"?>
-<p:properties xmlns:p="http://schemas.microsoft.com/office/2006/metadata/properties" xmlns:xsi="http://www.w3.org/2001/XMLSchema-instance" xmlns:pc="http://schemas.microsoft.com/office/infopath/2007/PartnerControls">
-  <documentManagement>
-    <_activity xmlns="91172594-76f2-42b4-b6c8-5686d13fb17f" xsi:nil="true"/>
-  </documentManagement>
-</p:properties>
-</file>
-
 <file path=customXml/itemProps1.xml><?xml version="1.0" encoding="utf-8"?>
-<ds:datastoreItem xmlns:ds="http://schemas.openxmlformats.org/officeDocument/2006/customXml" ds:itemID="{FCC1ACD0-7293-47C9-BE0B-4D879715608C}">
-  <ds:schemaRefs>
-    <ds:schemaRef ds:uri="http://schemas.openxmlformats.org/officeDocument/2006/bibliography"/>
-  </ds:schemaRefs>
-</ds:datastoreItem>
-</file>
-
-<file path=customXml/itemProps2.xml><?xml version="1.0" encoding="utf-8"?>
 <ds:datastoreItem xmlns:ds="http://schemas.openxmlformats.org/officeDocument/2006/customXml" ds:itemID="{8A7A12AC-3EA6-42CF-BE43-5DF49F85A7B6}">
   <ds:schemaRefs>
     <ds:schemaRef ds:uri="http://schemas.microsoft.com/office/2006/metadata/contentType"/>
@@ -8329,15 +8510,15 @@
 </ds:datastoreItem>
 </file>
 
-<file path=customXml/itemProps3.xml><?xml version="1.0" encoding="utf-8"?>
-<ds:datastoreItem xmlns:ds="http://schemas.openxmlformats.org/officeDocument/2006/customXml" ds:itemID="{510AB3BD-BC06-4C1C-BE0E-F78D828DF9A1}">
+<file path=customXml/itemProps2.xml><?xml version="1.0" encoding="utf-8"?>
+<ds:datastoreItem xmlns:ds="http://schemas.openxmlformats.org/officeDocument/2006/customXml" ds:itemID="{FCC1ACD0-7293-47C9-BE0B-4D879715608C}">
   <ds:schemaRefs>
-    <ds:schemaRef ds:uri="http://schemas.microsoft.com/sharepoint/v3/contenttype/forms"/>
+    <ds:schemaRef ds:uri="http://schemas.openxmlformats.org/officeDocument/2006/bibliography"/>
   </ds:schemaRefs>
 </ds:datastoreItem>
 </file>
 
-<file path=customXml/itemProps4.xml><?xml version="1.0" encoding="utf-8"?>
+<file path=customXml/itemProps3.xml><?xml version="1.0" encoding="utf-8"?>
 <ds:datastoreItem xmlns:ds="http://schemas.openxmlformats.org/officeDocument/2006/customXml" ds:itemID="{B4565CB4-100A-4A3D-B4D6-384A4DEF81CB}">
   <ds:schemaRefs>
     <ds:schemaRef ds:uri="http://schemas.microsoft.com/office/2006/metadata/properties"/>
@@ -8345,4 +8526,12 @@
     <ds:schemaRef ds:uri="91172594-76f2-42b4-b6c8-5686d13fb17f"/>
   </ds:schemaRefs>
 </ds:datastoreItem>
+</file>
+
+<file path=customXml/itemProps4.xml><?xml version="1.0" encoding="utf-8"?>
+<ds:datastoreItem xmlns:ds="http://schemas.openxmlformats.org/officeDocument/2006/customXml" ds:itemID="{510AB3BD-BC06-4C1C-BE0E-F78D828DF9A1}">
+  <ds:schemaRefs>
+    <ds:schemaRef ds:uri="http://schemas.microsoft.com/sharepoint/v3/contenttype/forms"/>
+  </ds:schemaRefs>
+</ds:datastoreItem>
 </file>
</xml_diff>

<commit_message>
continued build out of GUI compatible functions
</commit_message>
<xml_diff>
--- a/EconAutomation/src/supporting_docs/econ_report_templates/PVLCP_report_template.docx
+++ b/EconAutomation/src/supporting_docs/econ_report_templates/PVLCP_report_template.docx
@@ -51,7 +51,7 @@
           <w:sz w:val="24"/>
           <w:szCs w:val="24"/>
         </w:rPr>
-        <w:t>May 7, 2026</w:t>
+        <w:t>May 17, 2026</w:t>
       </w:r>
       <w:r>
         <w:rPr>
@@ -751,7 +751,7 @@
           <w:szCs w:val="24"/>
           <w:highlight w:val="red"/>
         </w:rPr>
-        <w:t>PV_Summary_No_Rounding_Total_</w:t>
+        <w:t>PV_Summary_No_Rounding_Total_High</w:t>
       </w:r>
       <w:r>
         <w:rPr>
@@ -760,7 +760,7 @@
           <w:szCs w:val="24"/>
           <w:highlight w:val="red"/>
         </w:rPr>
-        <w:t>High</w:t>
+        <w:t xml:space="preserve"> }}</w:t>
       </w:r>
       <w:r>
         <w:rPr>
@@ -769,7 +769,7 @@
           <w:szCs w:val="24"/>
           <w:highlight w:val="red"/>
         </w:rPr>
-        <w:t xml:space="preserve"> }}</w:t>
+        <w:t xml:space="preserve"> </w:t>
       </w:r>
       <w:r>
         <w:rPr>
@@ -778,84 +778,65 @@
           <w:szCs w:val="24"/>
           <w:highlight w:val="red"/>
         </w:rPr>
+        <w:t xml:space="preserve">in order to fund future medical </w:t>
+      </w:r>
+      <w:r>
+        <w:rPr>
+          <w:rFonts w:ascii="Times New Roman" w:hAnsi="Times New Roman" w:cs="Times New Roman"/>
+          <w:sz w:val="24"/>
+          <w:szCs w:val="24"/>
+          <w:highlight w:val="red"/>
+        </w:rPr>
+        <w:t>care,</w:t>
+      </w:r>
+      <w:r>
+        <w:rPr>
+          <w:rFonts w:ascii="Times New Roman" w:hAnsi="Times New Roman" w:cs="Times New Roman"/>
+          <w:sz w:val="24"/>
+          <w:szCs w:val="24"/>
+          <w:highlight w:val="red"/>
+        </w:rPr>
+        <w:t xml:space="preserve"> depending on realized costs. The midpoint </w:t>
+      </w:r>
+      <w:r>
+        <w:rPr>
+          <w:rFonts w:ascii="Times New Roman" w:hAnsi="Times New Roman" w:cs="Times New Roman"/>
+          <w:spacing w:val="-10"/>
+          <w:sz w:val="24"/>
+          <w:szCs w:val="24"/>
+          <w:highlight w:val="red"/>
+        </w:rPr>
+        <w:t>is</w:t>
+      </w:r>
+      <w:r>
+        <w:rPr>
+          <w:rFonts w:ascii="Times New Roman" w:hAnsi="Times New Roman" w:cs="Times New Roman"/>
+          <w:spacing w:val="-10"/>
+          <w:sz w:val="24"/>
+          <w:szCs w:val="24"/>
+          <w:highlight w:val="red"/>
+        </w:rPr>
         <w:t xml:space="preserve"> </w:t>
       </w:r>
       <w:r>
         <w:rPr>
           <w:rFonts w:ascii="Times New Roman" w:hAnsi="Times New Roman" w:cs="Times New Roman"/>
+          <w:spacing w:val="-10"/>
           <w:sz w:val="24"/>
           <w:szCs w:val="24"/>
           <w:highlight w:val="red"/>
         </w:rPr>
-        <w:t xml:space="preserve">in order to fund future medical </w:t>
-      </w:r>
-      <w:r>
-        <w:rPr>
-          <w:rFonts w:ascii="Times New Roman" w:hAnsi="Times New Roman" w:cs="Times New Roman"/>
+        <w:t xml:space="preserve">{{ </w:t>
+      </w:r>
+      <w:r>
+        <w:rPr>
+          <w:rFonts w:ascii="Times New Roman" w:hAnsi="Times New Roman" w:cs="Times New Roman"/>
+          <w:spacing w:val="-10"/>
           <w:sz w:val="24"/>
           <w:szCs w:val="24"/>
           <w:highlight w:val="red"/>
         </w:rPr>
-        <w:t>care,</w:t>
-      </w:r>
-      <w:r>
-        <w:rPr>
-          <w:rFonts w:ascii="Times New Roman" w:hAnsi="Times New Roman" w:cs="Times New Roman"/>
-          <w:sz w:val="24"/>
-          <w:szCs w:val="24"/>
-          <w:highlight w:val="red"/>
-        </w:rPr>
-        <w:t xml:space="preserve"> depending on realized costs. The midpoint </w:t>
-      </w:r>
-      <w:r>
-        <w:rPr>
-          <w:rFonts w:ascii="Times New Roman" w:hAnsi="Times New Roman" w:cs="Times New Roman"/>
-          <w:spacing w:val="-10"/>
-          <w:sz w:val="24"/>
-          <w:szCs w:val="24"/>
-          <w:highlight w:val="red"/>
-        </w:rPr>
-        <w:t>is</w:t>
-      </w:r>
-      <w:r>
-        <w:rPr>
-          <w:rFonts w:ascii="Times New Roman" w:hAnsi="Times New Roman" w:cs="Times New Roman"/>
-          <w:spacing w:val="-10"/>
-          <w:sz w:val="24"/>
-          <w:szCs w:val="24"/>
-          <w:highlight w:val="red"/>
-        </w:rPr>
-        <w:t xml:space="preserve"> </w:t>
-      </w:r>
-      <w:r>
-        <w:rPr>
-          <w:rFonts w:ascii="Times New Roman" w:hAnsi="Times New Roman" w:cs="Times New Roman"/>
-          <w:spacing w:val="-10"/>
-          <w:sz w:val="24"/>
-          <w:szCs w:val="24"/>
-          <w:highlight w:val="red"/>
-        </w:rPr>
-        <w:t xml:space="preserve">{{ </w:t>
-      </w:r>
-      <w:r>
-        <w:rPr>
-          <w:rFonts w:ascii="Times New Roman" w:hAnsi="Times New Roman" w:cs="Times New Roman"/>
-          <w:spacing w:val="-10"/>
-          <w:sz w:val="24"/>
-          <w:szCs w:val="24"/>
-          <w:highlight w:val="red"/>
-        </w:rPr>
-        <w:t>PV_Summary_No_Rounding_Total_</w:t>
-      </w:r>
-      <w:r>
-        <w:rPr>
-          <w:rFonts w:ascii="Times New Roman" w:hAnsi="Times New Roman" w:cs="Times New Roman"/>
-          <w:spacing w:val="-10"/>
-          <w:sz w:val="24"/>
-          <w:szCs w:val="24"/>
-          <w:highlight w:val="red"/>
-        </w:rPr>
-        <w:t>Mid</w:t>
+        <w:t>PV_Summary_No_Rounding_Total_Mid</w:t>
       </w:r>
       <w:r>
         <w:rPr>
@@ -1253,6 +1234,14 @@
           <w:szCs w:val="24"/>
           <w:highlight w:val="yellow"/>
         </w:rPr>
+        <w:t>.</w:t>
+      </w:r>
+      <w:r>
+        <w:rPr>
+          <w:rFonts w:ascii="Times New Roman" w:hAnsi="Times New Roman" w:cs="Times New Roman"/>
+          <w:sz w:val="24"/>
+          <w:szCs w:val="24"/>
+        </w:rPr>
         <w:t xml:space="preserve"> </w:t>
       </w:r>
       <w:r>
@@ -1260,19 +1249,291 @@
           <w:rFonts w:ascii="Times New Roman" w:hAnsi="Times New Roman" w:cs="Times New Roman"/>
           <w:sz w:val="24"/>
           <w:szCs w:val="24"/>
+          <w:highlight w:val="green"/>
+        </w:rPr>
+        <w:t xml:space="preserve">The trial date is </w:t>
+      </w:r>
+      <w:r>
+        <w:rPr>
+          <w:rFonts w:ascii="Times New Roman" w:hAnsi="Times New Roman" w:cs="Times New Roman"/>
+          <w:sz w:val="24"/>
+          <w:szCs w:val="24"/>
+          <w:highlight w:val="yellow"/>
+        </w:rPr>
+        <w:t xml:space="preserve">{{ </w:t>
+      </w:r>
+      <w:r>
+        <w:rPr>
+          <w:rFonts w:ascii="Times New Roman" w:hAnsi="Times New Roman" w:cs="Times New Roman"/>
+          <w:sz w:val="24"/>
+          <w:szCs w:val="24"/>
+          <w:highlight w:val="yellow"/>
+        </w:rPr>
+        <w:t>trial_date</w:t>
+      </w:r>
+      <w:r>
+        <w:rPr>
+          <w:rFonts w:ascii="Times New Roman" w:hAnsi="Times New Roman" w:cs="Times New Roman"/>
+          <w:sz w:val="24"/>
+          <w:szCs w:val="24"/>
+          <w:highlight w:val="yellow"/>
+        </w:rPr>
+        <w:t>_long</w:t>
+      </w:r>
+      <w:r>
+        <w:rPr>
+          <w:rFonts w:ascii="Times New Roman" w:hAnsi="Times New Roman" w:cs="Times New Roman"/>
+          <w:sz w:val="24"/>
+          <w:szCs w:val="24"/>
+          <w:highlight w:val="yellow"/>
+        </w:rPr>
+        <w:t xml:space="preserve"> }}</w:t>
+      </w:r>
+      <w:r>
+        <w:rPr>
+          <w:rFonts w:ascii="Times New Roman" w:hAnsi="Times New Roman" w:cs="Times New Roman"/>
+          <w:sz w:val="24"/>
+          <w:szCs w:val="24"/>
+          <w:highlight w:val="yellow"/>
+        </w:rPr>
+        <w:t>.</w:t>
+      </w:r>
+    </w:p>
+    <w:p>
+      <w:pPr>
+        <w:jc w:val="both"/>
+        <w:rPr>
+          <w:rFonts w:ascii="Times New Roman" w:hAnsi="Times New Roman" w:cs="Times New Roman"/>
+          <w:sz w:val="24"/>
+          <w:szCs w:val="24"/>
+        </w:rPr>
+      </w:pPr>
+    </w:p>
+    <w:p>
+      <w:pPr>
+        <w:jc w:val="center"/>
+        <w:rPr>
+          <w:rFonts w:ascii="Times New Roman" w:hAnsi="Times New Roman" w:cs="Times New Roman"/>
+          <w:sz w:val="24"/>
+          <w:szCs w:val="24"/>
+        </w:rPr>
+      </w:pPr>
+      <w:r>
+        <w:rPr>
+          <w:rFonts w:ascii="Times New Roman" w:hAnsi="Times New Roman" w:cs="Times New Roman"/>
+          <w:sz w:val="24"/>
+          <w:szCs w:val="24"/>
+        </w:rPr>
+        <w:t>DISCOUNT RATES</w:t>
+      </w:r>
+    </w:p>
+    <w:p>
+      <w:pPr>
+        <w:jc w:val="both"/>
+        <w:rPr>
+          <w:rFonts w:ascii="Times New Roman" w:hAnsi="Times New Roman" w:cs="Times New Roman"/>
+          <w:sz w:val="24"/>
+          <w:szCs w:val="24"/>
+          <w:highlight w:val="yellow"/>
+        </w:rPr>
+      </w:pPr>
+      <w:r>
+        <w:rPr>
+          <w:rFonts w:ascii="Times New Roman" w:hAnsi="Times New Roman" w:cs="Times New Roman"/>
+          <w:sz w:val="24"/>
+          <w:szCs w:val="24"/>
+        </w:rPr>
+        <w:t>Discount rates ensure that any pecuniary award for future medical care accounts for the potential investment return </w:t>
+      </w:r>
+      <w:r>
+        <w:rPr>
+          <w:rFonts w:ascii="Times New Roman" w:hAnsi="Times New Roman" w:cs="Times New Roman"/>
+          <w:sz w:val="24"/>
+          <w:szCs w:val="24"/>
+          <w:highlight w:val="yellow"/>
+        </w:rPr>
+        <w:t xml:space="preserve">{{ </w:t>
+      </w:r>
+      <w:r>
+        <w:rPr>
+          <w:rFonts w:ascii="Times New Roman" w:hAnsi="Times New Roman" w:cs="Times New Roman"/>
+          <w:sz w:val="24"/>
+          <w:szCs w:val="24"/>
+          <w:highlight w:val="yellow"/>
+        </w:rPr>
+        <w:t>claimant_salutation_with_name_last</w:t>
+      </w:r>
+      <w:r>
+        <w:rPr>
+          <w:rFonts w:ascii="Times New Roman" w:hAnsi="Times New Roman" w:cs="Times New Roman"/>
+          <w:sz w:val="24"/>
+          <w:szCs w:val="24"/>
+          <w:highlight w:val="yellow"/>
+        </w:rPr>
+        <w:t xml:space="preserve"> }}</w:t>
+      </w:r>
+      <w:r>
+        <w:rPr>
+          <w:rFonts w:ascii="Times New Roman" w:hAnsi="Times New Roman" w:cs="Times New Roman"/>
+          <w:sz w:val="24"/>
+          <w:szCs w:val="24"/>
+        </w:rPr>
+        <w:t xml:space="preserve"> may earn to fund future medical care. The discount rate is </w:t>
+      </w:r>
+      <w:r>
+        <w:rPr>
+          <w:rFonts w:ascii="Times New Roman" w:hAnsi="Times New Roman" w:cs="Times New Roman"/>
+          <w:sz w:val="24"/>
+          <w:szCs w:val="24"/>
+        </w:rPr>
+        <w:t>laddered,</w:t>
+      </w:r>
+      <w:r>
+        <w:rPr>
+          <w:rFonts w:ascii="Times New Roman" w:hAnsi="Times New Roman" w:cs="Times New Roman"/>
+          <w:sz w:val="24"/>
+          <w:szCs w:val="24"/>
+        </w:rPr>
+        <w:t xml:space="preserve"> allowing investment yields to match the future duration of </w:t>
+      </w:r>
+      <w:r>
+        <w:rPr>
+          <w:rFonts w:ascii="Times New Roman" w:hAnsi="Times New Roman" w:cs="Times New Roman"/>
+          <w:sz w:val="24"/>
+          <w:szCs w:val="24"/>
+        </w:rPr>
+        <w:t>costs,</w:t>
+      </w:r>
+      <w:r>
+        <w:rPr>
+          <w:rFonts w:ascii="Times New Roman" w:hAnsi="Times New Roman" w:cs="Times New Roman"/>
+          <w:sz w:val="24"/>
+          <w:szCs w:val="24"/>
+        </w:rPr>
+        <w:t xml:space="preserve"> which will ensure that any present value award is exhausted at the end of the duration. Discount rates are derived from current benchmark yields on AAA</w:t>
+      </w:r>
+      <w:r>
+        <w:rPr>
+          <w:rFonts w:ascii="Times New Roman" w:hAnsi="Times New Roman" w:cs="Times New Roman"/>
+          <w:sz w:val="24"/>
+          <w:szCs w:val="24"/>
+        </w:rPr>
+        <w:t>-</w:t>
+      </w:r>
+      <w:r>
+        <w:rPr>
+          <w:rFonts w:ascii="Times New Roman" w:hAnsi="Times New Roman" w:cs="Times New Roman"/>
+          <w:sz w:val="24"/>
+          <w:szCs w:val="24"/>
+        </w:rPr>
+        <w:t xml:space="preserve">rated municipal bonds </w:t>
+      </w:r>
+      <w:r>
+        <w:rPr>
+          <w:rFonts w:ascii="Times New Roman" w:hAnsi="Times New Roman" w:cs="Times New Roman"/>
+          <w:sz w:val="24"/>
+          <w:szCs w:val="24"/>
+        </w:rPr>
+        <w:t xml:space="preserve">and </w:t>
+      </w:r>
+      <w:r>
+        <w:rPr>
+          <w:rFonts w:ascii="Times New Roman" w:hAnsi="Times New Roman" w:cs="Times New Roman"/>
+          <w:sz w:val="24"/>
+          <w:szCs w:val="24"/>
+        </w:rPr>
+        <w:t>are enumerated in the figures at the end of this narrative</w:t>
+      </w:r>
+      <w:r>
+        <w:rPr>
+          <w:rFonts w:ascii="Times New Roman" w:hAnsi="Times New Roman" w:cs="Times New Roman"/>
+          <w:sz w:val="24"/>
+          <w:szCs w:val="24"/>
+        </w:rPr>
+        <w:t>.</w:t>
+      </w:r>
+      <w:r>
+        <w:rPr>
+          <w:rFonts w:ascii="Times New Roman" w:hAnsi="Times New Roman" w:cs="Times New Roman"/>
+          <w:sz w:val="24"/>
+          <w:szCs w:val="24"/>
+        </w:rPr>
+        <w:t xml:space="preserve"> </w:t>
+      </w:r>
+      <w:r>
+        <w:rPr>
+          <w:rFonts w:ascii="Times New Roman" w:hAnsi="Times New Roman" w:cs="Times New Roman"/>
+          <w:sz w:val="24"/>
+          <w:szCs w:val="24"/>
+          <w:highlight w:val="green"/>
+        </w:rPr>
+        <w:t xml:space="preserve">For </w:t>
+      </w:r>
+      <w:commentRangeStart w:id="0"/>
+      <w:r>
+        <w:rPr>
+          <w:rFonts w:ascii="Times New Roman" w:hAnsi="Times New Roman" w:cs="Times New Roman"/>
+          <w:sz w:val="24"/>
+          <w:szCs w:val="24"/>
+          <w:highlight w:val="green"/>
+        </w:rPr>
+        <w:t xml:space="preserve">maturities </w:t>
+      </w:r>
+      <w:commentRangeEnd w:id="0"/>
+      <w:r>
+        <w:rPr>
+          <w:rStyle w:val="CommentReference"/>
+          <w:rFonts w:ascii="Times New Roman" w:hAnsi="Times New Roman" w:cs="Times New Roman"/>
+          <w:sz w:val="24"/>
+          <w:szCs w:val="24"/>
+          <w:highlight w:val="green"/>
+        </w:rPr>
+        <w:commentReference w:id="0"/>
+      </w:r>
+      <w:r>
+        <w:rPr>
+          <w:rFonts w:ascii="Times New Roman" w:hAnsi="Times New Roman" w:cs="Times New Roman"/>
+          <w:sz w:val="24"/>
+          <w:szCs w:val="24"/>
+          <w:highlight w:val="green"/>
+        </w:rPr>
+        <w:t>greater than 30 years</w:t>
+      </w:r>
+      <w:r>
+        <w:rPr>
+          <w:rFonts w:ascii="Times New Roman" w:hAnsi="Times New Roman" w:cs="Times New Roman"/>
+          <w:sz w:val="24"/>
+          <w:szCs w:val="24"/>
+          <w:highlight w:val="green"/>
+        </w:rPr>
+        <w:t>, I use the longest available maturity of</w:t>
+      </w:r>
+      <w:r>
+        <w:rPr>
+          <w:rFonts w:ascii="Times New Roman" w:hAnsi="Times New Roman" w:cs="Times New Roman"/>
+          <w:sz w:val="24"/>
+          <w:szCs w:val="24"/>
+        </w:rPr>
+        <w:t xml:space="preserve"> </w:t>
+      </w:r>
+      <w:r>
+        <w:rPr>
+          <w:rFonts w:ascii="Times New Roman" w:hAnsi="Times New Roman" w:cs="Times New Roman"/>
+          <w:sz w:val="24"/>
+          <w:szCs w:val="24"/>
           <w:highlight w:val="red"/>
         </w:rPr>
-        <w:t>(rounded to 1</w:t>
-      </w:r>
+        <w:t>{</w:t>
+      </w:r>
+      <w:commentRangeStart w:id="1"/>
       <w:r>
         <w:rPr>
           <w:rFonts w:ascii="Times New Roman" w:hAnsi="Times New Roman" w:cs="Times New Roman"/>
           <w:sz w:val="24"/>
           <w:szCs w:val="24"/>
           <w:highlight w:val="red"/>
-          <w:vertAlign w:val="superscript"/>
-        </w:rPr>
-        <w:t>st</w:t>
+        </w:rPr>
+        <w:t xml:space="preserve">{ </w:t>
       </w:r>
       <w:r>
         <w:rPr>
@@ -1281,455 +1542,138 @@
           <w:szCs w:val="24"/>
           <w:highlight w:val="red"/>
         </w:rPr>
-        <w:t xml:space="preserve"> of month)</w:t>
-      </w:r>
-      <w:r>
-        <w:rPr>
+        <w:t>WC_disc_rate_max</w:t>
+      </w:r>
+      <w:r>
+        <w:rPr>
+          <w:rFonts w:ascii="Times New Roman" w:hAnsi="Times New Roman" w:cs="Times New Roman"/>
+          <w:sz w:val="24"/>
+          <w:szCs w:val="24"/>
+          <w:highlight w:val="red"/>
+        </w:rPr>
+        <w:t xml:space="preserve"> }}</w:t>
+      </w:r>
+      <w:r>
+        <w:rPr>
+          <w:rFonts w:ascii="Times New Roman" w:hAnsi="Times New Roman" w:cs="Times New Roman"/>
+          <w:sz w:val="24"/>
+          <w:szCs w:val="24"/>
+        </w:rPr>
+        <w:t>.</w:t>
+      </w:r>
+      <w:r>
+        <w:rPr>
+          <w:rFonts w:ascii="Times New Roman" w:hAnsi="Times New Roman" w:cs="Times New Roman"/>
+          <w:sz w:val="24"/>
+          <w:szCs w:val="24"/>
+        </w:rPr>
+        <w:t xml:space="preserve"> </w:t>
+      </w:r>
+      <w:r>
+        <w:rPr>
+          <w:rFonts w:ascii="Times New Roman" w:hAnsi="Times New Roman" w:cs="Times New Roman"/>
+          <w:sz w:val="24"/>
+          <w:szCs w:val="24"/>
+        </w:rPr>
+        <w:t xml:space="preserve">Discount rates range from </w:t>
+      </w:r>
+      <w:r>
+        <w:rPr>
+          <w:rFonts w:ascii="Times New Roman" w:hAnsi="Times New Roman" w:cs="Times New Roman"/>
+          <w:sz w:val="24"/>
+          <w:szCs w:val="24"/>
+          <w:highlight w:val="red"/>
+        </w:rPr>
+        <w:t xml:space="preserve">{{ </w:t>
+      </w:r>
+      <w:r>
+        <w:rPr>
+          <w:rFonts w:ascii="Times New Roman" w:hAnsi="Times New Roman" w:cs="Times New Roman"/>
+          <w:sz w:val="24"/>
+          <w:szCs w:val="24"/>
+          <w:highlight w:val="red"/>
+        </w:rPr>
+        <w:t>WC_disc_rate_</w:t>
+      </w:r>
+      <w:r>
+        <w:rPr>
+          <w:rFonts w:ascii="Times New Roman" w:hAnsi="Times New Roman" w:cs="Times New Roman"/>
+          <w:sz w:val="24"/>
+          <w:szCs w:val="24"/>
+          <w:highlight w:val="red"/>
+        </w:rPr>
+        <w:t>min</w:t>
+      </w:r>
+      <w:r>
+        <w:rPr>
+          <w:rFonts w:ascii="Times New Roman" w:hAnsi="Times New Roman" w:cs="Times New Roman"/>
+          <w:sz w:val="24"/>
+          <w:szCs w:val="24"/>
+          <w:highlight w:val="red"/>
+        </w:rPr>
+        <w:t xml:space="preserve"> }}</w:t>
+      </w:r>
+      <w:r>
+        <w:rPr>
+          <w:rFonts w:ascii="Times New Roman" w:hAnsi="Times New Roman" w:cs="Times New Roman"/>
+          <w:sz w:val="24"/>
+          <w:szCs w:val="24"/>
+        </w:rPr>
+        <w:t xml:space="preserve"> to </w:t>
+      </w:r>
+      <w:r>
+        <w:rPr>
+          <w:rFonts w:ascii="Times New Roman" w:hAnsi="Times New Roman" w:cs="Times New Roman"/>
+          <w:sz w:val="24"/>
+          <w:szCs w:val="24"/>
+          <w:highlight w:val="red"/>
+        </w:rPr>
+        <w:t xml:space="preserve">{{ </w:t>
+      </w:r>
+      <w:r>
+        <w:rPr>
+          <w:rFonts w:ascii="Times New Roman" w:hAnsi="Times New Roman" w:cs="Times New Roman"/>
+          <w:sz w:val="24"/>
+          <w:szCs w:val="24"/>
+          <w:highlight w:val="red"/>
+        </w:rPr>
+        <w:t>WC_disc_rate_</w:t>
+      </w:r>
+      <w:r>
+        <w:rPr>
+          <w:rFonts w:ascii="Times New Roman" w:hAnsi="Times New Roman" w:cs="Times New Roman"/>
+          <w:sz w:val="24"/>
+          <w:szCs w:val="24"/>
+          <w:highlight w:val="red"/>
+        </w:rPr>
+        <w:t>max</w:t>
+      </w:r>
+      <w:r>
+        <w:rPr>
+          <w:rFonts w:ascii="Times New Roman" w:hAnsi="Times New Roman" w:cs="Times New Roman"/>
+          <w:sz w:val="24"/>
+          <w:szCs w:val="24"/>
+          <w:highlight w:val="red"/>
+        </w:rPr>
+        <w:t xml:space="preserve"> }}</w:t>
+      </w:r>
+      <w:r>
+        <w:rPr>
+          <w:rFonts w:ascii="Times New Roman" w:hAnsi="Times New Roman" w:cs="Times New Roman"/>
+          <w:sz w:val="24"/>
+          <w:szCs w:val="24"/>
+        </w:rPr>
+        <w:t>.</w:t>
+      </w:r>
+      <w:commentRangeEnd w:id="1"/>
+      <w:r>
+        <w:rPr>
+          <w:rStyle w:val="CommentReference"/>
           <w:rFonts w:ascii="Times New Roman" w:hAnsi="Times New Roman" w:cs="Times New Roman"/>
           <w:sz w:val="24"/>
           <w:szCs w:val="24"/>
           <w:highlight w:val="yellow"/>
         </w:rPr>
-        <w:t>.</w:t>
-      </w:r>
-      <w:r>
-        <w:rPr>
-          <w:rFonts w:ascii="Times New Roman" w:hAnsi="Times New Roman" w:cs="Times New Roman"/>
-          <w:sz w:val="24"/>
-          <w:szCs w:val="24"/>
-        </w:rPr>
-        <w:t xml:space="preserve"> </w:t>
-      </w:r>
-      <w:r>
-        <w:rPr>
-          <w:rFonts w:ascii="Times New Roman" w:hAnsi="Times New Roman" w:cs="Times New Roman"/>
-          <w:sz w:val="24"/>
-          <w:szCs w:val="24"/>
-          <w:highlight w:val="green"/>
-        </w:rPr>
-        <w:t xml:space="preserve">The trial date is </w:t>
-      </w:r>
-      <w:r>
-        <w:rPr>
-          <w:rFonts w:ascii="Times New Roman" w:hAnsi="Times New Roman" w:cs="Times New Roman"/>
-          <w:sz w:val="24"/>
-          <w:szCs w:val="24"/>
-          <w:highlight w:val="yellow"/>
-        </w:rPr>
-        <w:t xml:space="preserve">{{ </w:t>
-      </w:r>
-      <w:r>
-        <w:rPr>
-          <w:rFonts w:ascii="Times New Roman" w:hAnsi="Times New Roman" w:cs="Times New Roman"/>
-          <w:sz w:val="24"/>
-          <w:szCs w:val="24"/>
-          <w:highlight w:val="yellow"/>
-        </w:rPr>
-        <w:t>trial_date</w:t>
-      </w:r>
-      <w:r>
-        <w:rPr>
-          <w:rFonts w:ascii="Times New Roman" w:hAnsi="Times New Roman" w:cs="Times New Roman"/>
-          <w:sz w:val="24"/>
-          <w:szCs w:val="24"/>
-          <w:highlight w:val="yellow"/>
-        </w:rPr>
-        <w:t>_long</w:t>
-      </w:r>
-      <w:r>
-        <w:rPr>
-          <w:rFonts w:ascii="Times New Roman" w:hAnsi="Times New Roman" w:cs="Times New Roman"/>
-          <w:sz w:val="24"/>
-          <w:szCs w:val="24"/>
-          <w:highlight w:val="yellow"/>
-        </w:rPr>
-        <w:t xml:space="preserve"> }}</w:t>
-      </w:r>
-      <w:r>
-        <w:rPr>
-          <w:rFonts w:ascii="Times New Roman" w:hAnsi="Times New Roman" w:cs="Times New Roman"/>
-          <w:sz w:val="24"/>
-          <w:szCs w:val="24"/>
-          <w:highlight w:val="yellow"/>
-        </w:rPr>
-        <w:t>.</w:t>
-      </w:r>
-    </w:p>
-    <w:p>
-      <w:pPr>
-        <w:jc w:val="both"/>
-        <w:rPr>
-          <w:rFonts w:ascii="Times New Roman" w:hAnsi="Times New Roman" w:cs="Times New Roman"/>
-          <w:sz w:val="24"/>
-          <w:szCs w:val="24"/>
-        </w:rPr>
-      </w:pPr>
-    </w:p>
-    <w:p>
-      <w:pPr>
-        <w:jc w:val="center"/>
-        <w:rPr>
-          <w:rFonts w:ascii="Times New Roman" w:hAnsi="Times New Roman" w:cs="Times New Roman"/>
-          <w:sz w:val="24"/>
-          <w:szCs w:val="24"/>
-        </w:rPr>
-      </w:pPr>
-      <w:r>
-        <w:rPr>
-          <w:rFonts w:ascii="Times New Roman" w:hAnsi="Times New Roman" w:cs="Times New Roman"/>
-          <w:sz w:val="24"/>
-          <w:szCs w:val="24"/>
-        </w:rPr>
-        <w:t>DISCOUNT RATES</w:t>
-      </w:r>
-    </w:p>
-    <w:p>
-      <w:pPr>
-        <w:jc w:val="both"/>
-        <w:rPr>
-          <w:rFonts w:ascii="Times New Roman" w:hAnsi="Times New Roman" w:cs="Times New Roman"/>
-          <w:sz w:val="24"/>
-          <w:szCs w:val="24"/>
-          <w:highlight w:val="yellow"/>
-        </w:rPr>
-      </w:pPr>
-      <w:r>
-        <w:rPr>
-          <w:rFonts w:ascii="Times New Roman" w:hAnsi="Times New Roman" w:cs="Times New Roman"/>
-          <w:sz w:val="24"/>
-          <w:szCs w:val="24"/>
-        </w:rPr>
-        <w:t>Discount rates ensure that any pecuniary award for future medical care accounts for the potential investment return </w:t>
-      </w:r>
-      <w:r>
-        <w:rPr>
-          <w:rFonts w:ascii="Times New Roman" w:hAnsi="Times New Roman" w:cs="Times New Roman"/>
-          <w:sz w:val="24"/>
-          <w:szCs w:val="24"/>
-          <w:highlight w:val="yellow"/>
-        </w:rPr>
-        <w:t xml:space="preserve">{{ </w:t>
-      </w:r>
-      <w:r>
-        <w:rPr>
-          <w:rFonts w:ascii="Times New Roman" w:hAnsi="Times New Roman" w:cs="Times New Roman"/>
-          <w:sz w:val="24"/>
-          <w:szCs w:val="24"/>
-          <w:highlight w:val="yellow"/>
-        </w:rPr>
-        <w:t>claimant_salutation_with_name_last</w:t>
-      </w:r>
-      <w:r>
-        <w:rPr>
-          <w:rFonts w:ascii="Times New Roman" w:hAnsi="Times New Roman" w:cs="Times New Roman"/>
-          <w:sz w:val="24"/>
-          <w:szCs w:val="24"/>
-          <w:highlight w:val="yellow"/>
-        </w:rPr>
-        <w:t xml:space="preserve"> }}</w:t>
-      </w:r>
-      <w:r>
-        <w:rPr>
-          <w:rFonts w:ascii="Times New Roman" w:hAnsi="Times New Roman" w:cs="Times New Roman"/>
-          <w:sz w:val="24"/>
-          <w:szCs w:val="24"/>
-        </w:rPr>
-        <w:t xml:space="preserve"> may earn to fund future medical care. The discount rate is </w:t>
-      </w:r>
-      <w:r>
-        <w:rPr>
-          <w:rFonts w:ascii="Times New Roman" w:hAnsi="Times New Roman" w:cs="Times New Roman"/>
-          <w:sz w:val="24"/>
-          <w:szCs w:val="24"/>
-        </w:rPr>
-        <w:t>laddered,</w:t>
-      </w:r>
-      <w:r>
-        <w:rPr>
-          <w:rFonts w:ascii="Times New Roman" w:hAnsi="Times New Roman" w:cs="Times New Roman"/>
-          <w:sz w:val="24"/>
-          <w:szCs w:val="24"/>
-        </w:rPr>
-        <w:t xml:space="preserve"> allowing investment yields to match the future duration of </w:t>
-      </w:r>
-      <w:r>
-        <w:rPr>
-          <w:rFonts w:ascii="Times New Roman" w:hAnsi="Times New Roman" w:cs="Times New Roman"/>
-          <w:sz w:val="24"/>
-          <w:szCs w:val="24"/>
-        </w:rPr>
-        <w:t>costs,</w:t>
-      </w:r>
-      <w:r>
-        <w:rPr>
-          <w:rFonts w:ascii="Times New Roman" w:hAnsi="Times New Roman" w:cs="Times New Roman"/>
-          <w:sz w:val="24"/>
-          <w:szCs w:val="24"/>
-        </w:rPr>
-        <w:t xml:space="preserve"> which will ensure that any present value award is exhausted at the end of the duration. Discount rates are derived from current benchmark yields on AAA</w:t>
-      </w:r>
-      <w:r>
-        <w:rPr>
-          <w:rFonts w:ascii="Times New Roman" w:hAnsi="Times New Roman" w:cs="Times New Roman"/>
-          <w:sz w:val="24"/>
-          <w:szCs w:val="24"/>
-        </w:rPr>
-        <w:t>-</w:t>
-      </w:r>
-      <w:r>
-        <w:rPr>
-          <w:rFonts w:ascii="Times New Roman" w:hAnsi="Times New Roman" w:cs="Times New Roman"/>
-          <w:sz w:val="24"/>
-          <w:szCs w:val="24"/>
-        </w:rPr>
-        <w:t xml:space="preserve">rated municipal bonds </w:t>
-      </w:r>
-      <w:r>
-        <w:rPr>
-          <w:rFonts w:ascii="Times New Roman" w:hAnsi="Times New Roman" w:cs="Times New Roman"/>
-          <w:sz w:val="24"/>
-          <w:szCs w:val="24"/>
-        </w:rPr>
-        <w:t xml:space="preserve">and </w:t>
-      </w:r>
-      <w:r>
-        <w:rPr>
-          <w:rFonts w:ascii="Times New Roman" w:hAnsi="Times New Roman" w:cs="Times New Roman"/>
-          <w:sz w:val="24"/>
-          <w:szCs w:val="24"/>
-        </w:rPr>
-        <w:t>are enumerated in the figures at the end of this narrative</w:t>
-      </w:r>
-      <w:r>
-        <w:rPr>
-          <w:rFonts w:ascii="Times New Roman" w:hAnsi="Times New Roman" w:cs="Times New Roman"/>
-          <w:sz w:val="24"/>
-          <w:szCs w:val="24"/>
-        </w:rPr>
-        <w:t>.</w:t>
-      </w:r>
-      <w:r>
-        <w:rPr>
-          <w:rFonts w:ascii="Times New Roman" w:hAnsi="Times New Roman" w:cs="Times New Roman"/>
-          <w:sz w:val="24"/>
-          <w:szCs w:val="24"/>
-        </w:rPr>
-        <w:t xml:space="preserve"> </w:t>
-      </w:r>
-      <w:r>
-        <w:rPr>
-          <w:rFonts w:ascii="Times New Roman" w:hAnsi="Times New Roman" w:cs="Times New Roman"/>
-          <w:sz w:val="24"/>
-          <w:szCs w:val="24"/>
-          <w:highlight w:val="green"/>
-        </w:rPr>
-        <w:t xml:space="preserve">For </w:t>
-      </w:r>
-      <w:commentRangeStart w:id="0"/>
-      <w:r>
-        <w:rPr>
-          <w:rFonts w:ascii="Times New Roman" w:hAnsi="Times New Roman" w:cs="Times New Roman"/>
-          <w:sz w:val="24"/>
-          <w:szCs w:val="24"/>
-          <w:highlight w:val="green"/>
-        </w:rPr>
-        <w:t xml:space="preserve">maturities </w:t>
-      </w:r>
-      <w:commentRangeEnd w:id="0"/>
-      <w:r>
-        <w:rPr>
-          <w:rStyle w:val="CommentReference"/>
-          <w:rFonts w:ascii="Times New Roman" w:hAnsi="Times New Roman" w:cs="Times New Roman"/>
-          <w:sz w:val="24"/>
-          <w:szCs w:val="24"/>
-          <w:highlight w:val="green"/>
-        </w:rPr>
-        <w:commentReference w:id="0"/>
-      </w:r>
-      <w:r>
-        <w:rPr>
-          <w:rFonts w:ascii="Times New Roman" w:hAnsi="Times New Roman" w:cs="Times New Roman"/>
-          <w:sz w:val="24"/>
-          <w:szCs w:val="24"/>
-          <w:highlight w:val="green"/>
-        </w:rPr>
-        <w:t>greater than 30 years</w:t>
-      </w:r>
-      <w:r>
-        <w:rPr>
-          <w:rFonts w:ascii="Times New Roman" w:hAnsi="Times New Roman" w:cs="Times New Roman"/>
-          <w:sz w:val="24"/>
-          <w:szCs w:val="24"/>
-          <w:highlight w:val="green"/>
-        </w:rPr>
-        <w:t>, I use the longest available maturity of</w:t>
-      </w:r>
-      <w:r>
-        <w:rPr>
-          <w:rFonts w:ascii="Times New Roman" w:hAnsi="Times New Roman" w:cs="Times New Roman"/>
-          <w:sz w:val="24"/>
-          <w:szCs w:val="24"/>
-        </w:rPr>
-        <w:t xml:space="preserve"> </w:t>
-      </w:r>
-      <w:r>
-        <w:rPr>
-          <w:rFonts w:ascii="Times New Roman" w:hAnsi="Times New Roman" w:cs="Times New Roman"/>
-          <w:sz w:val="24"/>
-          <w:szCs w:val="24"/>
-          <w:highlight w:val="red"/>
-        </w:rPr>
-        <w:t>{</w:t>
-      </w:r>
-      <w:commentRangeStart w:id="1"/>
-      <w:r>
-        <w:rPr>
-          <w:rFonts w:ascii="Times New Roman" w:hAnsi="Times New Roman" w:cs="Times New Roman"/>
-          <w:sz w:val="24"/>
-          <w:szCs w:val="24"/>
-          <w:highlight w:val="red"/>
-        </w:rPr>
-        <w:t xml:space="preserve">{ </w:t>
-      </w:r>
-      <w:r>
-        <w:rPr>
-          <w:rFonts w:ascii="Times New Roman" w:hAnsi="Times New Roman" w:cs="Times New Roman"/>
-          <w:sz w:val="24"/>
-          <w:szCs w:val="24"/>
-          <w:highlight w:val="red"/>
-        </w:rPr>
-        <w:t>WC_disc_rate_max</w:t>
-      </w:r>
-      <w:r>
-        <w:rPr>
-          <w:rFonts w:ascii="Times New Roman" w:hAnsi="Times New Roman" w:cs="Times New Roman"/>
-          <w:sz w:val="24"/>
-          <w:szCs w:val="24"/>
-          <w:highlight w:val="red"/>
-        </w:rPr>
-        <w:t xml:space="preserve"> }}</w:t>
-      </w:r>
-      <w:r>
-        <w:rPr>
-          <w:rFonts w:ascii="Times New Roman" w:hAnsi="Times New Roman" w:cs="Times New Roman"/>
-          <w:sz w:val="24"/>
-          <w:szCs w:val="24"/>
-        </w:rPr>
-        <w:t>.</w:t>
-      </w:r>
-      <w:r>
-        <w:rPr>
-          <w:rFonts w:ascii="Times New Roman" w:hAnsi="Times New Roman" w:cs="Times New Roman"/>
-          <w:sz w:val="24"/>
-          <w:szCs w:val="24"/>
-        </w:rPr>
-        <w:t xml:space="preserve"> </w:t>
-      </w:r>
-      <w:r>
-        <w:rPr>
-          <w:rFonts w:ascii="Times New Roman" w:hAnsi="Times New Roman" w:cs="Times New Roman"/>
-          <w:sz w:val="24"/>
-          <w:szCs w:val="24"/>
-        </w:rPr>
-        <w:t xml:space="preserve">Discount rates range from </w:t>
-      </w:r>
-      <w:r>
-        <w:rPr>
-          <w:rFonts w:ascii="Times New Roman" w:hAnsi="Times New Roman" w:cs="Times New Roman"/>
-          <w:sz w:val="24"/>
-          <w:szCs w:val="24"/>
-          <w:highlight w:val="red"/>
-        </w:rPr>
-        <w:t xml:space="preserve">{{ </w:t>
-      </w:r>
-      <w:r>
-        <w:rPr>
-          <w:rFonts w:ascii="Times New Roman" w:hAnsi="Times New Roman" w:cs="Times New Roman"/>
-          <w:sz w:val="24"/>
-          <w:szCs w:val="24"/>
-          <w:highlight w:val="red"/>
-        </w:rPr>
-        <w:t>WC_disc_rate_</w:t>
-      </w:r>
-      <w:r>
-        <w:rPr>
-          <w:rFonts w:ascii="Times New Roman" w:hAnsi="Times New Roman" w:cs="Times New Roman"/>
-          <w:sz w:val="24"/>
-          <w:szCs w:val="24"/>
-          <w:highlight w:val="red"/>
-        </w:rPr>
-        <w:t>min</w:t>
-      </w:r>
-      <w:r>
-        <w:rPr>
-          <w:rFonts w:ascii="Times New Roman" w:hAnsi="Times New Roman" w:cs="Times New Roman"/>
-          <w:sz w:val="24"/>
-          <w:szCs w:val="24"/>
-          <w:highlight w:val="red"/>
-        </w:rPr>
-        <w:t xml:space="preserve"> }}</w:t>
-      </w:r>
-      <w:r>
-        <w:rPr>
-          <w:rFonts w:ascii="Times New Roman" w:hAnsi="Times New Roman" w:cs="Times New Roman"/>
-          <w:sz w:val="24"/>
-          <w:szCs w:val="24"/>
-        </w:rPr>
-        <w:t xml:space="preserve"> to </w:t>
-      </w:r>
-      <w:r>
-        <w:rPr>
-          <w:rFonts w:ascii="Times New Roman" w:hAnsi="Times New Roman" w:cs="Times New Roman"/>
-          <w:sz w:val="24"/>
-          <w:szCs w:val="24"/>
-          <w:highlight w:val="red"/>
-        </w:rPr>
-        <w:t xml:space="preserve">{{ </w:t>
-      </w:r>
-      <w:r>
-        <w:rPr>
-          <w:rFonts w:ascii="Times New Roman" w:hAnsi="Times New Roman" w:cs="Times New Roman"/>
-          <w:sz w:val="24"/>
-          <w:szCs w:val="24"/>
-          <w:highlight w:val="red"/>
-        </w:rPr>
-        <w:t>WC_disc_rate_</w:t>
-      </w:r>
-      <w:r>
-        <w:rPr>
-          <w:rFonts w:ascii="Times New Roman" w:hAnsi="Times New Roman" w:cs="Times New Roman"/>
-          <w:sz w:val="24"/>
-          <w:szCs w:val="24"/>
-          <w:highlight w:val="red"/>
-        </w:rPr>
-        <w:t>max</w:t>
-      </w:r>
-      <w:r>
-        <w:rPr>
-          <w:rFonts w:ascii="Times New Roman" w:hAnsi="Times New Roman" w:cs="Times New Roman"/>
-          <w:sz w:val="24"/>
-          <w:szCs w:val="24"/>
-          <w:highlight w:val="red"/>
-        </w:rPr>
-        <w:t xml:space="preserve"> }}</w:t>
-      </w:r>
-      <w:r>
-        <w:rPr>
-          <w:rFonts w:ascii="Times New Roman" w:hAnsi="Times New Roman" w:cs="Times New Roman"/>
-          <w:sz w:val="24"/>
-          <w:szCs w:val="24"/>
-        </w:rPr>
-        <w:t>.</w:t>
-      </w:r>
-      <w:commentRangeEnd w:id="1"/>
-      <w:r>
-        <w:rPr>
-          <w:rStyle w:val="CommentReference"/>
-          <w:rFonts w:ascii="Times New Roman" w:hAnsi="Times New Roman" w:cs="Times New Roman"/>
-          <w:sz w:val="24"/>
-          <w:szCs w:val="24"/>
-          <w:highlight w:val="yellow"/>
-        </w:rPr>
         <w:commentReference w:id="1"/>
       </w:r>
     </w:p>
@@ -1747,7 +1691,6 @@
           <w:sz w:val="24"/>
           <w:szCs w:val="24"/>
         </w:rPr>
-        <w:lastRenderedPageBreak/>
         <w:br w:type="page"/>
       </w:r>
     </w:p>
@@ -8296,6 +8239,27 @@
 </file>
 
 <file path=customXml/item1.xml><?xml version="1.0" encoding="utf-8"?>
+<?mso-contentType ?>
+<FormTemplates xmlns="http://schemas.microsoft.com/sharepoint/v3/contenttype/forms">
+  <Display>DocumentLibraryForm</Display>
+  <Edit>DocumentLibraryForm</Edit>
+  <New>DocumentLibraryForm</New>
+</FormTemplates>
+</file>
+
+<file path=customXml/item2.xml><?xml version="1.0" encoding="utf-8"?>
+<p:properties xmlns:p="http://schemas.microsoft.com/office/2006/metadata/properties" xmlns:xsi="http://www.w3.org/2001/XMLSchema-instance" xmlns:pc="http://schemas.microsoft.com/office/infopath/2007/PartnerControls">
+  <documentManagement>
+    <_activity xmlns="91172594-76f2-42b4-b6c8-5686d13fb17f" xsi:nil="true"/>
+  </documentManagement>
+</p:properties>
+</file>
+
+<file path=customXml/item3.xml><?xml version="1.0" encoding="utf-8"?>
+<b:Sources xmlns:b="http://schemas.openxmlformats.org/officeDocument/2006/bibliography" xmlns="http://schemas.openxmlformats.org/officeDocument/2006/bibliography" SelectedStyle="\APASixthEditionOfficeOnline.xsl" StyleName="APA" Version="6"/>
+</file>
+
+<file path=customXml/item4.xml><?xml version="1.0" encoding="utf-8"?>
 <ct:contentTypeSchema xmlns:ct="http://schemas.microsoft.com/office/2006/metadata/contentType" xmlns:ma="http://schemas.microsoft.com/office/2006/metadata/properties/metaAttributes" ct:_="" ma:_="" ma:contentTypeName="Document" ma:contentTypeID="0x010100085B5888F14DAE46912A6E0F6FCFCB07" ma:contentTypeVersion="9" ma:contentTypeDescription="Create a new document." ma:contentTypeScope="" ma:versionID="2185b18d6fd5c46c37ca5df071e41de6">
   <xsd:schema xmlns:xsd="http://www.w3.org/2001/XMLSchema" xmlns:xs="http://www.w3.org/2001/XMLSchema" xmlns:p="http://schemas.microsoft.com/office/2006/metadata/properties" xmlns:ns3="91172594-76f2-42b4-b6c8-5686d13fb17f" targetNamespace="http://schemas.microsoft.com/office/2006/metadata/properties" ma:root="true" ma:fieldsID="3ce95284eb097024ce56720a48b923a2" ns3:_="">
     <xsd:import namespace="91172594-76f2-42b4-b6c8-5686d13fb17f"/>
@@ -8471,28 +8435,33 @@
 </ct:contentTypeSchema>
 </file>
 
-<file path=customXml/item2.xml><?xml version="1.0" encoding="utf-8"?>
-<b:Sources xmlns:b="http://schemas.openxmlformats.org/officeDocument/2006/bibliography" xmlns="http://schemas.openxmlformats.org/officeDocument/2006/bibliography" SelectedStyle="\APASixthEditionOfficeOnline.xsl" StyleName="APA" Version="6"/>
+<file path=customXml/itemProps1.xml><?xml version="1.0" encoding="utf-8"?>
+<ds:datastoreItem xmlns:ds="http://schemas.openxmlformats.org/officeDocument/2006/customXml" ds:itemID="{510AB3BD-BC06-4C1C-BE0E-F78D828DF9A1}">
+  <ds:schemaRefs>
+    <ds:schemaRef ds:uri="http://schemas.microsoft.com/sharepoint/v3/contenttype/forms"/>
+  </ds:schemaRefs>
+</ds:datastoreItem>
 </file>
 
-<file path=customXml/item3.xml><?xml version="1.0" encoding="utf-8"?>
-<p:properties xmlns:p="http://schemas.microsoft.com/office/2006/metadata/properties" xmlns:xsi="http://www.w3.org/2001/XMLSchema-instance" xmlns:pc="http://schemas.microsoft.com/office/infopath/2007/PartnerControls">
-  <documentManagement>
-    <_activity xmlns="91172594-76f2-42b4-b6c8-5686d13fb17f" xsi:nil="true"/>
-  </documentManagement>
-</p:properties>
+<file path=customXml/itemProps2.xml><?xml version="1.0" encoding="utf-8"?>
+<ds:datastoreItem xmlns:ds="http://schemas.openxmlformats.org/officeDocument/2006/customXml" ds:itemID="{B4565CB4-100A-4A3D-B4D6-384A4DEF81CB}">
+  <ds:schemaRefs>
+    <ds:schemaRef ds:uri="http://schemas.microsoft.com/office/2006/metadata/properties"/>
+    <ds:schemaRef ds:uri="http://schemas.microsoft.com/office/infopath/2007/PartnerControls"/>
+    <ds:schemaRef ds:uri="91172594-76f2-42b4-b6c8-5686d13fb17f"/>
+  </ds:schemaRefs>
+</ds:datastoreItem>
 </file>
 
-<file path=customXml/item4.xml><?xml version="1.0" encoding="utf-8"?>
-<?mso-contentType ?>
-<FormTemplates xmlns="http://schemas.microsoft.com/sharepoint/v3/contenttype/forms">
-  <Display>DocumentLibraryForm</Display>
-  <Edit>DocumentLibraryForm</Edit>
-  <New>DocumentLibraryForm</New>
-</FormTemplates>
+<file path=customXml/itemProps3.xml><?xml version="1.0" encoding="utf-8"?>
+<ds:datastoreItem xmlns:ds="http://schemas.openxmlformats.org/officeDocument/2006/customXml" ds:itemID="{FCC1ACD0-7293-47C9-BE0B-4D879715608C}">
+  <ds:schemaRefs>
+    <ds:schemaRef ds:uri="http://schemas.openxmlformats.org/officeDocument/2006/bibliography"/>
+  </ds:schemaRefs>
+</ds:datastoreItem>
 </file>
 
-<file path=customXml/itemProps1.xml><?xml version="1.0" encoding="utf-8"?>
+<file path=customXml/itemProps4.xml><?xml version="1.0" encoding="utf-8"?>
 <ds:datastoreItem xmlns:ds="http://schemas.openxmlformats.org/officeDocument/2006/customXml" ds:itemID="{8A7A12AC-3EA6-42CF-BE43-5DF49F85A7B6}">
   <ds:schemaRefs>
     <ds:schemaRef ds:uri="http://schemas.microsoft.com/office/2006/metadata/contentType"/>
@@ -8508,30 +8477,4 @@
     <ds:schemaRef ds:uri="http://schemas.microsoft.com/internal/obd"/>
   </ds:schemaRefs>
 </ds:datastoreItem>
-</file>
-
-<file path=customXml/itemProps2.xml><?xml version="1.0" encoding="utf-8"?>
-<ds:datastoreItem xmlns:ds="http://schemas.openxmlformats.org/officeDocument/2006/customXml" ds:itemID="{FCC1ACD0-7293-47C9-BE0B-4D879715608C}">
-  <ds:schemaRefs>
-    <ds:schemaRef ds:uri="http://schemas.openxmlformats.org/officeDocument/2006/bibliography"/>
-  </ds:schemaRefs>
-</ds:datastoreItem>
-</file>
-
-<file path=customXml/itemProps3.xml><?xml version="1.0" encoding="utf-8"?>
-<ds:datastoreItem xmlns:ds="http://schemas.openxmlformats.org/officeDocument/2006/customXml" ds:itemID="{B4565CB4-100A-4A3D-B4D6-384A4DEF81CB}">
-  <ds:schemaRefs>
-    <ds:schemaRef ds:uri="http://schemas.microsoft.com/office/2006/metadata/properties"/>
-    <ds:schemaRef ds:uri="http://schemas.microsoft.com/office/infopath/2007/PartnerControls"/>
-    <ds:schemaRef ds:uri="91172594-76f2-42b4-b6c8-5686d13fb17f"/>
-  </ds:schemaRefs>
-</ds:datastoreItem>
-</file>
-
-<file path=customXml/itemProps4.xml><?xml version="1.0" encoding="utf-8"?>
-<ds:datastoreItem xmlns:ds="http://schemas.openxmlformats.org/officeDocument/2006/customXml" ds:itemID="{510AB3BD-BC06-4C1C-BE0E-F78D828DF9A1}">
-  <ds:schemaRefs>
-    <ds:schemaRef ds:uri="http://schemas.microsoft.com/sharepoint/v3/contenttype/forms"/>
-  </ds:schemaRefs>
-</ds:datastoreItem>
 </file>
</xml_diff>

<commit_message>
major debugging; rewriting of PV Earnings report template; etc.
</commit_message>
<xml_diff>
--- a/EconAutomation/src/supporting_docs/econ_report_templates/PVLCP_report_template.docx
+++ b/EconAutomation/src/supporting_docs/econ_report_templates/PVLCP_report_template.docx
@@ -51,7 +51,7 @@
           <w:sz w:val="24"/>
           <w:szCs w:val="24"/>
         </w:rPr>
-        <w:t>May 17, 2026</w:t>
+        <w:t>May 24, 2026</w:t>
       </w:r>
       <w:r>
         <w:rPr>
@@ -533,7 +533,23 @@
           <w:sz w:val="24"/>
           <w:szCs w:val="24"/>
         </w:rPr>
-        <w:t xml:space="preserve"> have reviewed the </w:t>
+        <w:t xml:space="preserve"> have reviewed the</w:t>
+      </w:r>
+      <w:r>
+        <w:rPr>
+          <w:rFonts w:ascii="Times New Roman" w:hAnsi="Times New Roman" w:cs="Times New Roman"/>
+          <w:sz w:val="24"/>
+          <w:szCs w:val="24"/>
+        </w:rPr>
+        <w:t xml:space="preserve"> {% if ‘LCP’ in rehab_report_types %}</w:t>
+      </w:r>
+      <w:r>
+        <w:rPr>
+          <w:rFonts w:ascii="Times New Roman" w:hAnsi="Times New Roman" w:cs="Times New Roman"/>
+          <w:sz w:val="24"/>
+          <w:szCs w:val="24"/>
+        </w:rPr>
+        <w:t xml:space="preserve"> </w:t>
       </w:r>
       <w:r>
         <w:rPr>
@@ -550,7 +566,15 @@
           <w:sz w:val="24"/>
           <w:szCs w:val="24"/>
         </w:rPr>
-        <w:t xml:space="preserve"> (or MCP)</w:t>
+        <w:t xml:space="preserve"> </w:t>
+      </w:r>
+      <w:r>
+        <w:rPr>
+          <w:rFonts w:ascii="Times New Roman" w:hAnsi="Times New Roman" w:cs="Times New Roman"/>
+          <w:sz w:val="24"/>
+          <w:szCs w:val="24"/>
+        </w:rPr>
+        <w:t>{% endif %}{% if ‘MCP’ in rehab_report_types %} Medical Cost Projection {% endif %}</w:t>
       </w:r>
       <w:r>
         <w:rPr>
@@ -574,9 +598,41 @@
           <w:rFonts w:ascii="Times New Roman" w:hAnsi="Times New Roman" w:cs="Times New Roman"/>
           <w:sz w:val="24"/>
           <w:szCs w:val="24"/>
+        </w:rPr>
+        <w:t>LCP_expert_name_full_with_titles</w:t>
+      </w:r>
+      <w:r>
+        <w:rPr>
+          <w:rFonts w:ascii="Times New Roman" w:hAnsi="Times New Roman" w:cs="Times New Roman"/>
+          <w:sz w:val="24"/>
+          <w:szCs w:val="24"/>
           <w:highlight w:val="yellow"/>
         </w:rPr>
-        <w:t>LCP_</w:t>
+        <w:t xml:space="preserve"> }}</w:t>
+      </w:r>
+      <w:r>
+        <w:rPr>
+          <w:rFonts w:ascii="Times New Roman" w:hAnsi="Times New Roman" w:cs="Times New Roman"/>
+          <w:sz w:val="24"/>
+          <w:szCs w:val="24"/>
+        </w:rPr>
+        <w:t>,</w:t>
+      </w:r>
+      <w:r>
+        <w:rPr>
+          <w:rFonts w:ascii="Times New Roman" w:hAnsi="Times New Roman" w:cs="Times New Roman"/>
+          <w:sz w:val="24"/>
+          <w:szCs w:val="24"/>
+        </w:rPr>
+        <w:t xml:space="preserve"> </w:t>
+      </w:r>
+      <w:r>
+        <w:rPr>
+          <w:rFonts w:ascii="Times New Roman" w:hAnsi="Times New Roman" w:cs="Times New Roman"/>
+          <w:sz w:val="24"/>
+          <w:szCs w:val="24"/>
+        </w:rPr>
+        <w:t xml:space="preserve">dated </w:t>
       </w:r>
       <w:r>
         <w:rPr>
@@ -585,15 +641,15 @@
           <w:szCs w:val="24"/>
           <w:highlight w:val="yellow"/>
         </w:rPr>
-        <w:t>expert }}</w:t>
-      </w:r>
-      <w:r>
-        <w:rPr>
-          <w:rFonts w:ascii="Times New Roman" w:hAnsi="Times New Roman" w:cs="Times New Roman"/>
-          <w:sz w:val="24"/>
-          <w:szCs w:val="24"/>
-        </w:rPr>
-        <w:t>,</w:t>
+        <w:t xml:space="preserve">{{ </w:t>
+      </w:r>
+      <w:r>
+        <w:rPr>
+          <w:rFonts w:ascii="Times New Roman" w:hAnsi="Times New Roman" w:cs="Times New Roman"/>
+          <w:sz w:val="24"/>
+          <w:szCs w:val="24"/>
+        </w:rPr>
+        <w:t>LCP_report_date_short</w:t>
       </w:r>
       <w:r>
         <w:rPr>
@@ -608,35 +664,9 @@
           <w:rFonts w:ascii="Times New Roman" w:hAnsi="Times New Roman" w:cs="Times New Roman"/>
           <w:sz w:val="24"/>
           <w:szCs w:val="24"/>
-        </w:rPr>
-        <w:t xml:space="preserve">dated </w:t>
-      </w:r>
-      <w:r>
-        <w:rPr>
-          <w:rFonts w:ascii="Times New Roman" w:hAnsi="Times New Roman" w:cs="Times New Roman"/>
-          <w:sz w:val="24"/>
-          <w:szCs w:val="24"/>
           <w:highlight w:val="yellow"/>
         </w:rPr>
-        <w:t xml:space="preserve">{{ </w:t>
-      </w:r>
-      <w:r>
-        <w:rPr>
-          <w:rFonts w:ascii="Times New Roman" w:hAnsi="Times New Roman" w:cs="Times New Roman"/>
-          <w:sz w:val="24"/>
-          <w:szCs w:val="24"/>
-          <w:highlight w:val="yellow"/>
-        </w:rPr>
-        <w:t>report_deadline_long</w:t>
-      </w:r>
-      <w:r>
-        <w:rPr>
-          <w:rFonts w:ascii="Times New Roman" w:hAnsi="Times New Roman" w:cs="Times New Roman"/>
-          <w:sz w:val="24"/>
-          <w:szCs w:val="24"/>
-          <w:highlight w:val="yellow"/>
-        </w:rPr>
-        <w:t xml:space="preserve"> }}</w:t>
+        <w:t>}}</w:t>
       </w:r>
       <w:r>
         <w:rPr>
@@ -1506,7 +1536,17 @@
           <w:szCs w:val="24"/>
           <w:highlight w:val="green"/>
         </w:rPr>
-        <w:t>, I use the longest available maturity of</w:t>
+        <w:t xml:space="preserve">, I use the </w:t>
+      </w:r>
+      <w:r>
+        <w:rPr>
+          <w:rFonts w:ascii="Times New Roman" w:hAnsi="Times New Roman" w:cs="Times New Roman"/>
+          <w:sz w:val="24"/>
+          <w:szCs w:val="24"/>
+          <w:highlight w:val="green"/>
+        </w:rPr>
+        <w:lastRenderedPageBreak/>
+        <w:t>longest available maturity of</w:t>
       </w:r>
       <w:r>
         <w:rPr>
@@ -1945,7 +1985,7 @@
       </w:tblPr>
       <w:tblGrid>
         <w:gridCol w:w="4892"/>
-        <w:gridCol w:w="2296"/>
+        <w:gridCol w:w="2123"/>
       </w:tblGrid>
       <w:tr>
         <w:trPr>
@@ -8239,12 +8279,7 @@
 </file>
 
 <file path=customXml/item1.xml><?xml version="1.0" encoding="utf-8"?>
-<?mso-contentType ?>
-<FormTemplates xmlns="http://schemas.microsoft.com/sharepoint/v3/contenttype/forms">
-  <Display>DocumentLibraryForm</Display>
-  <Edit>DocumentLibraryForm</Edit>
-  <New>DocumentLibraryForm</New>
-</FormTemplates>
+<b:Sources xmlns:b="http://schemas.openxmlformats.org/officeDocument/2006/bibliography" xmlns="http://schemas.openxmlformats.org/officeDocument/2006/bibliography" SelectedStyle="\APASixthEditionOfficeOnline.xsl" StyleName="APA" Version="6"/>
 </file>
 
 <file path=customXml/item2.xml><?xml version="1.0" encoding="utf-8"?>
@@ -8256,7 +8291,12 @@
 </file>
 
 <file path=customXml/item3.xml><?xml version="1.0" encoding="utf-8"?>
-<b:Sources xmlns:b="http://schemas.openxmlformats.org/officeDocument/2006/bibliography" xmlns="http://schemas.openxmlformats.org/officeDocument/2006/bibliography" SelectedStyle="\APASixthEditionOfficeOnline.xsl" StyleName="APA" Version="6"/>
+<?mso-contentType ?>
+<FormTemplates xmlns="http://schemas.microsoft.com/sharepoint/v3/contenttype/forms">
+  <Display>DocumentLibraryForm</Display>
+  <Edit>DocumentLibraryForm</Edit>
+  <New>DocumentLibraryForm</New>
+</FormTemplates>
 </file>
 
 <file path=customXml/item4.xml><?xml version="1.0" encoding="utf-8"?>
@@ -8436,9 +8476,9 @@
 </file>
 
 <file path=customXml/itemProps1.xml><?xml version="1.0" encoding="utf-8"?>
-<ds:datastoreItem xmlns:ds="http://schemas.openxmlformats.org/officeDocument/2006/customXml" ds:itemID="{510AB3BD-BC06-4C1C-BE0E-F78D828DF9A1}">
+<ds:datastoreItem xmlns:ds="http://schemas.openxmlformats.org/officeDocument/2006/customXml" ds:itemID="{FCC1ACD0-7293-47C9-BE0B-4D879715608C}">
   <ds:schemaRefs>
-    <ds:schemaRef ds:uri="http://schemas.microsoft.com/sharepoint/v3/contenttype/forms"/>
+    <ds:schemaRef ds:uri="http://schemas.openxmlformats.org/officeDocument/2006/bibliography"/>
   </ds:schemaRefs>
 </ds:datastoreItem>
 </file>
@@ -8454,9 +8494,9 @@
 </file>
 
 <file path=customXml/itemProps3.xml><?xml version="1.0" encoding="utf-8"?>
-<ds:datastoreItem xmlns:ds="http://schemas.openxmlformats.org/officeDocument/2006/customXml" ds:itemID="{FCC1ACD0-7293-47C9-BE0B-4D879715608C}">
+<ds:datastoreItem xmlns:ds="http://schemas.openxmlformats.org/officeDocument/2006/customXml" ds:itemID="{510AB3BD-BC06-4C1C-BE0E-F78D828DF9A1}">
   <ds:schemaRefs>
-    <ds:schemaRef ds:uri="http://schemas.openxmlformats.org/officeDocument/2006/bibliography"/>
+    <ds:schemaRef ds:uri="http://schemas.microsoft.com/sharepoint/v3/contenttype/forms"/>
   </ds:schemaRefs>
 </ds:datastoreItem>
 </file>

</xml_diff>